<commit_message>
Counsel package: cover memo, public-disclosure finding in the answers, file manifest
The responses now say that the disclosure timeline given to WSU is incomplete for
Parts A and B (SCRUB_PLAN.md), and the cover memo sets out the state of the
invention, the reading order and what the package leaves out.

Co-Authored-By: Claude Opus 5.5 (1M context) <noreply@anthropic.com>
Claude-Session: https://claude.ai/code/session_01KhMXuyQCiXvAKVFNqrvT2R
</commit_message>
<xml_diff>
--- a/provisional_patent/counsel/WSU_26-1902_Inventor_Responses_2026-10-20.docx
+++ b/provisional_patent/counsel/WSU_26-1902_Inventor_Responses_2026-10-20.docx
@@ -699,7 +699,7 @@
         <w:spacing w:after="120" w:line="276"/>
       </w:pPr>
       <w:r>
-        <w:t xml:space="preserve">Most answers are routine: ranges, alternatives and examples to widen the specification. Nine points change what is filed or when, and they are listed here in order of consequence.</w:t>
+        <w:t xml:space="preserve">Most answers are routine: ranges, alternatives and examples to widen the specification. Ten points change what is filed or when, and they are listed here in order of consequence.</w:t>
       </w:r>
     </w:p>
     <w:p>
@@ -720,6 +720,26 @@
       </w:r>
       <w:r>
         <w:t xml:space="preserve"> The draft (18 September) is a third invention: overlapping C-arm exposures linked into a chain, alternative alphabets, a confidence that commands the next move, and a persistent digital marker. The disclosure form (25 September) covers Part A (preoperative CT) and Part B (single C-arm exposure) and never mentions a chain, overlap or sweep. A supplemental disclosure to WSU should cover the chain (Q1, Figure 1).</w:t>
+      </w:r>
+    </w:p>
+    <w:p>
+      <w:pPr>
+        <w:pStyle w:val="ListParagraph"/>
+        <w:numPr>
+          <w:ilvl w:val="0"/>
+          <w:numId w:val="2"/>
+        </w:numPr>
+        <w:spacing w:after="100" w:line="268"/>
+      </w:pPr>
+      <w:r>
+        <w:rPr>
+          <w:b/>
+          <w:bCs/>
+        </w:rPr>
+        <w:t xml:space="preserve">The disclosure timeline given to WSU is incomplete for Parts A and B.</w:t>
+      </w:r>
+      <w:r>
+        <w:t xml:space="preserve"> It says no public item discloses either part. A later review of the public repositories (SCRUB_PLAN.md, 26 September) found that some did: documents pushed by mistake to the public CTSpinoPelvic1K repository on 4 September disclosed Part B concepts (an anchor at the sacral base, a transitional flag, the evaluation design); scripts public from 7 September implemented Part A elements (a rule-based call per record, the call printed with the scores behind it); a design note public by 27 August stated Part A's name-free premise in part; and a Zenodo build archive of 7 September carries Part A results. These cannot be withdrawn; for the United States they start the one-year grace period on the dates given, and abroad they count at once. The same review found nothing public about the chain. The GitHub Support purge requests drafted that day have no record of being filed. Section 6 of SCRUB_PLAN.md lists the corrections owed to the WSU package (Q1, Q5).</w:t>
       </w:r>
     </w:p>
     <w:p>
@@ -1389,7 +1409,17 @@
         <w:t xml:space="preserve">Links.</w:t>
       </w:r>
       <w:r>
-        <w:t xml:space="preserve"> Source links point to two private GitHub repositories at fixed commits (OpenSpineConsortium/spine-program and the inventor's spinesurg-ct-nnunet). They open only for an account given access. If counsel prefers, I can supply any linked file as an excerpt instead of granting access. Numbers marked RECORD ONLY are held-out results on renders with the annotation's boxes; they support the description and are not for marketing claims.</w:t>
+        <w:t xml:space="preserve"> Source links point to two private GitHub repositories at fixed commits (OpenSpineConsortium/spine-program and the inventor's spinesurg-ct-nnunet), which open only for an account given access. </w:t>
+      </w:r>
+      <w:r>
+        <w:rPr>
+          <w:b/>
+          <w:bCs/>
+        </w:rPr>
+        <w:t xml:space="preserve">Every linked file is also in this package, in the folder 05_Evidence; Appendix D maps each link to its file.</w:t>
+      </w:r>
+      <w:r>
+        <w:t xml:space="preserve"> Numbers marked RECORD ONLY are held-out results on renders with the annotation's boxes; they support the description and are not for marketing claims.</w:t>
       </w:r>
     </w:p>
     <w:p>
@@ -2860,6 +2890,21 @@
         <w:spacing w:after="120" w:line="276"/>
       </w:pPr>
       <w:r>
+        <w:rPr>
+          <w:b/>
+          <w:bCs/>
+        </w:rPr>
+        <w:t xml:space="preserve">One correction to the WSU package bears on Part A.</w:t>
+      </w:r>
+      <w:r>
+        <w:t xml:space="preserve"> The disclosure timeline says nothing public discloses Part A or Part B. The review of 26 September (SCRUB_PLAN.md) found Part A elements public in the CTSpinoPelvic1K repository: a design note stating, in part, that the segmentation classes carry no vertebral identity (by 27 August), scripts making a rule-based call per record and printing the scores behind it (7 September), and Part A results in a Zenodo build archive (7 September). Part B concepts were public from 4 September in documents pushed by mistake and later removed, which remain fetchable by commit. Counsel should weigh these against any Part A or Part B claim; none of them touches the chain.</w:t>
+      </w:r>
+    </w:p>
+    <w:p>
+      <w:pPr>
+        <w:spacing w:after="120" w:line="276"/>
+      </w:pPr>
+      <w:r>
         <w:t xml:space="preserve">"Not as claimed" in the README means that what has already been made public (the NeurIPS paper, the dataset, the AACA slides) does not disclose Part A's classifier as it would be claimed. It does not mean that Part A is ready.</w:t>
       </w:r>
     </w:p>
@@ -2932,7 +2977,7 @@
         </w:rPr>
         <w:t xml:space="preserve">Sources: </w:t>
       </w:r>
-      <w:hyperlink w:history="1" r:id="rIdoogkcnmgmmrctqliljxex">
+      <w:hyperlink w:history="1" r:id="rIduh8dy7dl2zou15bala335">
         <w:r>
           <w:rPr>
             <w:rStyle w:val="Hyperlink"/>
@@ -2950,7 +2995,25 @@
         </w:rPr>
         <w:t xml:space="preserve">; </w:t>
       </w:r>
-      <w:hyperlink w:history="1" r:id="rIdhwty4_rkdpu50j282jz4p">
+      <w:hyperlink w:history="1" r:id="rIdkw3_ji-mqv4lf0hmr4zwu">
+        <w:r>
+          <w:rPr>
+            <w:rStyle w:val="Hyperlink"/>
+            <w:sz w:val="18"/>
+            <w:szCs w:val="18"/>
+          </w:rPr>
+          <w:t xml:space="preserve">SCRUB_PLAN.md</w:t>
+        </w:r>
+      </w:hyperlink>
+      <w:r>
+        <w:rPr>
+          <w:color w:val="52514E"/>
+          <w:sz w:val="18"/>
+          <w:szCs w:val="18"/>
+        </w:rPr>
+        <w:t xml:space="preserve">; </w:t>
+      </w:r>
+      <w:hyperlink w:history="1" r:id="rIdvubws41szk20mvu-ar-af">
         <w:r>
           <w:rPr>
             <w:rStyle w:val="Hyperlink"/>
@@ -2968,7 +3031,7 @@
         </w:rPr>
         <w:t xml:space="preserve">; </w:t>
       </w:r>
-      <w:hyperlink w:history="1" r:id="rIdu_qi0v-oyybneeqdcphga">
+      <w:hyperlink w:history="1" r:id="rIdlv7gjblldke6soh93_dtz">
         <w:r>
           <w:rPr>
             <w:rStyle w:val="Hyperlink"/>
@@ -2986,7 +3049,7 @@
         </w:rPr>
         <w:t xml:space="preserve">; </w:t>
       </w:r>
-      <w:hyperlink w:history="1" r:id="rIdnmfox61vro8zkcbmip702">
+      <w:hyperlink w:history="1" r:id="rIddwfo1glzbotxjqqkkesss">
         <w:r>
           <w:rPr>
             <w:rStyle w:val="Hyperlink"/>
@@ -3004,7 +3067,7 @@
         </w:rPr>
         <w:t xml:space="preserve">; </w:t>
       </w:r>
-      <w:hyperlink w:history="1" r:id="rIdmott3hoahhnni-mwm6bv9">
+      <w:hyperlink w:history="1" r:id="rId52jnbsbs_duxqgyggxclp">
         <w:r>
           <w:rPr>
             <w:rStyle w:val="Hyperlink"/>
@@ -3135,7 +3198,7 @@
         </w:rPr>
         <w:t xml:space="preserve">Sources: </w:t>
       </w:r>
-      <w:hyperlink w:history="1" r:id="rIdatnnxwqnuuvcu1pdlaygi">
+      <w:hyperlink w:history="1" r:id="rIdcg8e_amwy88q9aqfdtfkr">
         <w:r>
           <w:rPr>
             <w:rStyle w:val="Hyperlink"/>
@@ -3153,7 +3216,7 @@
         </w:rPr>
         <w:t xml:space="preserve">; </w:t>
       </w:r>
-      <w:hyperlink w:history="1" r:id="rIdsgi2eogryobhwc7cia3kj">
+      <w:hyperlink w:history="1" r:id="rIdm6nkakyo4_lo4lauacr6b">
         <w:r>
           <w:rPr>
             <w:rStyle w:val="Hyperlink"/>
@@ -3333,7 +3396,7 @@
         </w:rPr>
         <w:t xml:space="preserve">Sources: </w:t>
       </w:r>
-      <w:hyperlink w:history="1" r:id="rIdx20nszyabl5cn7rq8dfew">
+      <w:hyperlink w:history="1" r:id="rId1q6uco_aqswoivmtta6sx">
         <w:r>
           <w:rPr>
             <w:rStyle w:val="Hyperlink"/>
@@ -3351,7 +3414,7 @@
         </w:rPr>
         <w:t xml:space="preserve">; </w:t>
       </w:r>
-      <w:hyperlink w:history="1" r:id="rIdwvb7zfadnxlaqwd4ekilz">
+      <w:hyperlink w:history="1" r:id="rIdnnctoxw8uedxm8s0relae">
         <w:r>
           <w:rPr>
             <w:rStyle w:val="Hyperlink"/>
@@ -3369,7 +3432,7 @@
         </w:rPr>
         <w:t xml:space="preserve">; </w:t>
       </w:r>
-      <w:hyperlink w:history="1" r:id="rIdqrshrrh5in2ga3n6r8pzi">
+      <w:hyperlink w:history="1" r:id="rIdk7350sx5vduj9pujppgj_">
         <w:r>
           <w:rPr>
             <w:rStyle w:val="Hyperlink"/>
@@ -3499,7 +3562,7 @@
         </w:rPr>
         <w:t xml:space="preserve">Sources: </w:t>
       </w:r>
-      <w:hyperlink w:history="1" r:id="rIdydy0pilx-5pmif8zr7uuk">
+      <w:hyperlink w:history="1" r:id="rId3cnw64ncqj05fm-oqy_be">
         <w:r>
           <w:rPr>
             <w:rStyle w:val="Hyperlink"/>
@@ -3604,6 +3667,21 @@
           <w:b/>
           <w:bCs/>
         </w:rPr>
+        <w:t xml:space="preserve">Earlier public items, for completeness.</w:t>
+      </w:r>
+      <w:r>
+        <w:t xml:space="preserve"> Part B concepts (not results) were public from 4 September 2026 in documents later removed from the CTSpinoPelvic1K repository but still fetchable by commit; see Q1 and SCRUB_PLAN.md. No chain material was found in any public place.</w:t>
+      </w:r>
+    </w:p>
+    <w:p>
+      <w:pPr>
+        <w:spacing w:after="120" w:line="276"/>
+      </w:pPr>
+      <w:r>
+        <w:rPr>
+          <w:b/>
+          <w:bCs/>
+        </w:rPr>
         <w:t xml:space="preserve">Expected timing: not recorded.</w:t>
       </w:r>
       <w:r>
@@ -3651,7 +3729,7 @@
         </w:rPr>
         <w:t xml:space="preserve">Sources: </w:t>
       </w:r>
-      <w:hyperlink w:history="1" r:id="rIdhqxwlqejhb0ddnsqxg0tv">
+      <w:hyperlink w:history="1" r:id="rIdiumqowevfl-xt8_0_inog">
         <w:r>
           <w:rPr>
             <w:rStyle w:val="Hyperlink"/>
@@ -3669,7 +3747,7 @@
         </w:rPr>
         <w:t xml:space="preserve">; </w:t>
       </w:r>
-      <w:hyperlink w:history="1" r:id="rIdrokwkzrqffjidvm408egu">
+      <w:hyperlink w:history="1" r:id="rIdotsxk5voiqnwo1zhxh8px">
         <w:r>
           <w:rPr>
             <w:rStyle w:val="Hyperlink"/>
@@ -3687,7 +3765,7 @@
         </w:rPr>
         <w:t xml:space="preserve">; </w:t>
       </w:r>
-      <w:hyperlink w:history="1" r:id="rId8amyohtdmarek46rxxi3g">
+      <w:hyperlink w:history="1" r:id="rIdtqejeheyaxygragzomlwn">
         <w:r>
           <w:rPr>
             <w:rStyle w:val="Hyperlink"/>
@@ -3697,6 +3775,24 @@
           <w:t xml:space="preserve">SX-Stitch_request.md (draft, not sent)</w:t>
         </w:r>
       </w:hyperlink>
+      <w:r>
+        <w:rPr>
+          <w:color w:val="52514E"/>
+          <w:sz w:val="18"/>
+          <w:szCs w:val="18"/>
+        </w:rPr>
+        <w:t xml:space="preserve">; </w:t>
+      </w:r>
+      <w:hyperlink w:history="1" r:id="rId61ehunydn6d_1q_dnwopb">
+        <w:r>
+          <w:rPr>
+            <w:rStyle w:val="Hyperlink"/>
+            <w:sz w:val="18"/>
+            <w:szCs w:val="18"/>
+          </w:rPr>
+          <w:t xml:space="preserve">SCRUB_PLAN.md</w:t>
+        </w:r>
+      </w:hyperlink>
     </w:p>
     <w:p>
       <w:pPr>
@@ -3845,7 +3941,7 @@
         </w:rPr>
         <w:t xml:space="preserve">Sources: </w:t>
       </w:r>
-      <w:hyperlink w:history="1" r:id="rIdm-6pdplxalvagghkg2ncg">
+      <w:hyperlink w:history="1" r:id="rIduf4nfxz3xodceelsztfp4">
         <w:r>
           <w:rPr>
             <w:rStyle w:val="Hyperlink"/>
@@ -3863,7 +3959,7 @@
         </w:rPr>
         <w:t xml:space="preserve">; </w:t>
       </w:r>
-      <w:hyperlink w:history="1" r:id="rIdjgbo6dirr2cb9gjux90gm">
+      <w:hyperlink w:history="1" r:id="rIdg4zkf5tayccwwp9jcmsh0">
         <w:r>
           <w:rPr>
             <w:rStyle w:val="Hyperlink"/>
@@ -3986,7 +4082,7 @@
         </w:rPr>
         <w:t xml:space="preserve">Sources: </w:t>
       </w:r>
-      <w:hyperlink w:history="1" r:id="rIdxwpo9jjy4tnbij5exrfzr">
+      <w:hyperlink w:history="1" r:id="rIdsiecn2jta6g2kwt6q2e6c">
         <w:r>
           <w:rPr>
             <w:rStyle w:val="Hyperlink"/>
@@ -4124,7 +4220,7 @@
         </w:rPr>
         <w:t xml:space="preserve">Sources: </w:t>
       </w:r>
-      <w:hyperlink w:history="1" r:id="rId7hg01geuditlirrcumrms">
+      <w:hyperlink w:history="1" r:id="rIdocwv31uiioy7ogxsxui0v">
         <w:r>
           <w:rPr>
             <w:rStyle w:val="Hyperlink"/>
@@ -4236,7 +4332,7 @@
         </w:rPr>
         <w:t xml:space="preserve">Sources: </w:t>
       </w:r>
-      <w:hyperlink w:history="1" r:id="rIdwilh8_okfwzbffx3iffqf">
+      <w:hyperlink w:history="1" r:id="rId1zr0q9zv8y6ycgxuaflhs">
         <w:r>
           <w:rPr>
             <w:rStyle w:val="Hyperlink"/>
@@ -4431,7 +4527,7 @@
         </w:rPr>
         <w:t xml:space="preserve">Sources: </w:t>
       </w:r>
-      <w:hyperlink w:history="1" r:id="rIdi2t5usfunyttvs0dl3fa-">
+      <w:hyperlink w:history="1" r:id="rIdwlpdft3qnek3qohwaxbuj">
         <w:r>
           <w:rPr>
             <w:rStyle w:val="Hyperlink"/>
@@ -4449,7 +4545,7 @@
         </w:rPr>
         <w:t xml:space="preserve">; </w:t>
       </w:r>
-      <w:hyperlink w:history="1" r:id="rIdinqk6hxi2iv4ow_cmzj5g">
+      <w:hyperlink w:history="1" r:id="rIdr3gf6aocet6kostrb6lz-">
         <w:r>
           <w:rPr>
             <w:rStyle w:val="Hyperlink"/>
@@ -4603,7 +4699,7 @@
         </w:rPr>
         <w:t xml:space="preserve">Sources: </w:t>
       </w:r>
-      <w:hyperlink w:history="1" r:id="rIdriy4kdovuo11scazpfpny">
+      <w:hyperlink w:history="1" r:id="rIdtsanipgydi3qavoqrwuus">
         <w:r>
           <w:rPr>
             <w:rStyle w:val="Hyperlink"/>
@@ -4621,7 +4717,7 @@
         </w:rPr>
         <w:t xml:space="preserve">; </w:t>
       </w:r>
-      <w:hyperlink w:history="1" r:id="rIdng2covarlto-h_rszi1th">
+      <w:hyperlink w:history="1" r:id="rIdwdjoarxlmds9eckcmdjws">
         <w:r>
           <w:rPr>
             <w:rStyle w:val="Hyperlink"/>
@@ -4639,7 +4735,7 @@
         </w:rPr>
         <w:t xml:space="preserve">; </w:t>
       </w:r>
-      <w:hyperlink w:history="1" r:id="rIdyj_cwexz29mxjsrpkyz6r">
+      <w:hyperlink w:history="1" r:id="rIda0oyr6pdw4-0sx7oobr-r">
         <w:r>
           <w:rPr>
             <w:rStyle w:val="Hyperlink"/>
@@ -4752,7 +4848,7 @@
         </w:rPr>
         <w:t xml:space="preserve">Sources: </w:t>
       </w:r>
-      <w:hyperlink w:history="1" r:id="rIdxroclnmd0loc-whvbga7b">
+      <w:hyperlink w:history="1" r:id="rIdkqs9zs-hktfisgb0tccbu">
         <w:r>
           <w:rPr>
             <w:rStyle w:val="Hyperlink"/>
@@ -4770,7 +4866,7 @@
         </w:rPr>
         <w:t xml:space="preserve">; </w:t>
       </w:r>
-      <w:hyperlink w:history="1" r:id="rIdfqzezy5fv9v8pcdxdcadw">
+      <w:hyperlink w:history="1" r:id="rIdigieoes_c3v1ugi0fid5z">
         <w:r>
           <w:rPr>
             <w:rStyle w:val="Hyperlink"/>
@@ -4997,7 +5093,7 @@
         </w:rPr>
         <w:t xml:space="preserve">Sources: </w:t>
       </w:r>
-      <w:hyperlink w:history="1" r:id="rIds_gbvqafwcxyojtmxw27v">
+      <w:hyperlink w:history="1" r:id="rIdd22z8eil3ccst2x-hqljz">
         <w:r>
           <w:rPr>
             <w:rStyle w:val="Hyperlink"/>
@@ -5015,7 +5111,7 @@
         </w:rPr>
         <w:t xml:space="preserve">; </w:t>
       </w:r>
-      <w:hyperlink w:history="1" r:id="rIdv4xjn7t2itsrwsg2lrvnd">
+      <w:hyperlink w:history="1" r:id="rId-rysctce5j7fkf1a53e2j">
         <w:r>
           <w:rPr>
             <w:rStyle w:val="Hyperlink"/>
@@ -5033,7 +5129,7 @@
         </w:rPr>
         <w:t xml:space="preserve">; </w:t>
       </w:r>
-      <w:hyperlink w:history="1" r:id="rIdasftxmbig6ezuwb8tf7gk">
+      <w:hyperlink w:history="1" r:id="rIdxhcybfqgmp0et5oygxtws">
         <w:r>
           <w:rPr>
             <w:rStyle w:val="Hyperlink"/>
@@ -5051,7 +5147,7 @@
         </w:rPr>
         <w:t xml:space="preserve">; </w:t>
       </w:r>
-      <w:hyperlink w:history="1" r:id="rId-dpgiw9yndttbdwmhmbz6">
+      <w:hyperlink w:history="1" r:id="rIdutpchihvef0cfzpnqij0x">
         <w:r>
           <w:rPr>
             <w:rStyle w:val="Hyperlink"/>
@@ -5234,7 +5330,7 @@
         </w:rPr>
         <w:t xml:space="preserve">Sources: </w:t>
       </w:r>
-      <w:hyperlink w:history="1" r:id="rIdnqkgj5or-cgz8zqzozpg6">
+      <w:hyperlink w:history="1" r:id="rId93sqtd3ck7ocd_cduafyk">
         <w:r>
           <w:rPr>
             <w:rStyle w:val="Hyperlink"/>
@@ -5252,7 +5348,7 @@
         </w:rPr>
         <w:t xml:space="preserve">; </w:t>
       </w:r>
-      <w:hyperlink w:history="1" r:id="rIdoicuzhxvje1vo1lyclfra">
+      <w:hyperlink w:history="1" r:id="rIdgfktuht3hvaan-ntxokm_">
         <w:r>
           <w:rPr>
             <w:rStyle w:val="Hyperlink"/>
@@ -5270,7 +5366,7 @@
         </w:rPr>
         <w:t xml:space="preserve">; </w:t>
       </w:r>
-      <w:hyperlink w:history="1" r:id="rIdeum1vw5sebysndjuk-cqn">
+      <w:hyperlink w:history="1" r:id="rIdlnue1zbp76eyzccsnaud9">
         <w:r>
           <w:rPr>
             <w:rStyle w:val="Hyperlink"/>
@@ -5399,7 +5495,7 @@
         </w:rPr>
         <w:t xml:space="preserve">Sources: </w:t>
       </w:r>
-      <w:hyperlink w:history="1" r:id="rIdpf8uwaxfiardkvvnxrkx5">
+      <w:hyperlink w:history="1" r:id="rIduo_p12bblc26t9sjybukl">
         <w:r>
           <w:rPr>
             <w:rStyle w:val="Hyperlink"/>
@@ -5417,7 +5513,7 @@
         </w:rPr>
         <w:t xml:space="preserve">; </w:t>
       </w:r>
-      <w:hyperlink w:history="1" r:id="rIdcc8ubx2wup1k96bzh4hxp">
+      <w:hyperlink w:history="1" r:id="rIdtp61l468xp89fakuj8fae">
         <w:r>
           <w:rPr>
             <w:rStyle w:val="Hyperlink"/>
@@ -5537,7 +5633,7 @@
         </w:rPr>
         <w:t xml:space="preserve">Sources: </w:t>
       </w:r>
-      <w:hyperlink w:history="1" r:id="rIdogadjzgpggnstqrqcc90q">
+      <w:hyperlink w:history="1" r:id="rIdw6n_wcsx69f2vsas7j-sp">
         <w:r>
           <w:rPr>
             <w:rStyle w:val="Hyperlink"/>
@@ -5664,7 +5760,7 @@
         </w:rPr>
         <w:t xml:space="preserve">Sources: </w:t>
       </w:r>
-      <w:hyperlink w:history="1" r:id="rIdys8-kznozolqsaehy94gc">
+      <w:hyperlink w:history="1" r:id="rIdejatz-uwmksupvt1vavvc">
         <w:r>
           <w:rPr>
             <w:rStyle w:val="Hyperlink"/>
@@ -5769,7 +5865,7 @@
         </w:rPr>
         <w:t xml:space="preserve">Sources: </w:t>
       </w:r>
-      <w:hyperlink w:history="1" r:id="rIdy__x9kya28pbwjavtim9u">
+      <w:hyperlink w:history="1" r:id="rIdyv9tno1gxqv-k9r1zan8h">
         <w:r>
           <w:rPr>
             <w:rStyle w:val="Hyperlink"/>
@@ -5898,7 +5994,7 @@
         </w:rPr>
         <w:t xml:space="preserve">Sources: </w:t>
       </w:r>
-      <w:hyperlink w:history="1" r:id="rId_vi18wtgjaomdr8i-kkjn">
+      <w:hyperlink w:history="1" r:id="rId0mapntqxbqxpljie4wpd8">
         <w:r>
           <w:rPr>
             <w:rStyle w:val="Hyperlink"/>
@@ -5916,7 +6012,7 @@
         </w:rPr>
         <w:t xml:space="preserve">; </w:t>
       </w:r>
-      <w:hyperlink w:history="1" r:id="rIdl0m_bt32tsvpfi-5wdlme">
+      <w:hyperlink w:history="1" r:id="rId_edhtybfyawqof5kqikoo">
         <w:r>
           <w:rPr>
             <w:rStyle w:val="Hyperlink"/>
@@ -5934,7 +6030,7 @@
         </w:rPr>
         <w:t xml:space="preserve">; </w:t>
       </w:r>
-      <w:hyperlink w:history="1" r:id="rIdkn7eapkmutms-02del9mn">
+      <w:hyperlink w:history="1" r:id="rIdwkj5w9nuqv0jnrvt1kcct">
         <w:r>
           <w:rPr>
             <w:rStyle w:val="Hyperlink"/>
@@ -6079,7 +6175,7 @@
         </w:rPr>
         <w:t xml:space="preserve">Sources: </w:t>
       </w:r>
-      <w:hyperlink w:history="1" r:id="rIdic0zszp7hlb5hkromn0f1">
+      <w:hyperlink w:history="1" r:id="rId6xob3bfwkvkjcnkprmw5b">
         <w:r>
           <w:rPr>
             <w:rStyle w:val="Hyperlink"/>
@@ -6097,7 +6193,7 @@
         </w:rPr>
         <w:t xml:space="preserve">; </w:t>
       </w:r>
-      <w:hyperlink w:history="1" r:id="rIdjzwcyxac9m-3zjak6eudy">
+      <w:hyperlink w:history="1" r:id="rIdxp-byl9wahhnqsmcuwdf_">
         <w:r>
           <w:rPr>
             <w:rStyle w:val="Hyperlink"/>
@@ -6115,7 +6211,7 @@
         </w:rPr>
         <w:t xml:space="preserve">; </w:t>
       </w:r>
-      <w:hyperlink w:history="1" r:id="rIdkhnkxuaocjbryeue0zqs2">
+      <w:hyperlink w:history="1" r:id="rIdsdcqh77da0_3hpeabiq5i">
         <w:r>
           <w:rPr>
             <w:rStyle w:val="Hyperlink"/>
@@ -6297,7 +6393,7 @@
         </w:rPr>
         <w:t xml:space="preserve">Sources: </w:t>
       </w:r>
-      <w:hyperlink w:history="1" r:id="rIdflqybx0fxrcydqwrz7uw8">
+      <w:hyperlink w:history="1" r:id="rId_q3hcrmd2tzlz5eweool9">
         <w:r>
           <w:rPr>
             <w:rStyle w:val="Hyperlink"/>
@@ -6402,7 +6498,7 @@
         </w:rPr>
         <w:t xml:space="preserve">Sources: </w:t>
       </w:r>
-      <w:hyperlink w:history="1" r:id="rIdwipqqmdqsczzu8dokfv-r">
+      <w:hyperlink w:history="1" r:id="rIdffx1dbrtznwltuphbeia5">
         <w:r>
           <w:rPr>
             <w:rStyle w:val="Hyperlink"/>
@@ -6420,7 +6516,7 @@
         </w:rPr>
         <w:t xml:space="preserve">; </w:t>
       </w:r>
-      <w:hyperlink w:history="1" r:id="rId8uu1wktoqbglrowbib5hl">
+      <w:hyperlink w:history="1" r:id="rIdv8hf9yhxma__ztxjetbss">
         <w:r>
           <w:rPr>
             <w:rStyle w:val="Hyperlink"/>
@@ -6525,7 +6621,7 @@
         </w:rPr>
         <w:t xml:space="preserve">Sources: </w:t>
       </w:r>
-      <w:hyperlink w:history="1" r:id="rIdu0vdp5cu5pmgzfgy8mgrv">
+      <w:hyperlink w:history="1" r:id="rId9cntgmolbaa4twjddv2bn">
         <w:r>
           <w:rPr>
             <w:rStyle w:val="Hyperlink"/>
@@ -6637,7 +6733,7 @@
         </w:rPr>
         <w:t xml:space="preserve">Sources: </w:t>
       </w:r>
-      <w:hyperlink w:history="1" r:id="rIdm7sfiarydyzslyq7na2hm">
+      <w:hyperlink w:history="1" r:id="rId4_6bd_ujrbol4yjdbyrd1">
         <w:r>
           <w:rPr>
             <w:rStyle w:val="Hyperlink"/>
@@ -6757,7 +6853,7 @@
         </w:rPr>
         <w:t xml:space="preserve">Sources: </w:t>
       </w:r>
-      <w:hyperlink w:history="1" r:id="rId8luny98vfoam7rzheokog">
+      <w:hyperlink w:history="1" r:id="rIdvengbhqs3thw4x5sgtryx">
         <w:r>
           <w:rPr>
             <w:rStyle w:val="Hyperlink"/>
@@ -6775,7 +6871,7 @@
         </w:rPr>
         <w:t xml:space="preserve">; </w:t>
       </w:r>
-      <w:hyperlink w:history="1" r:id="rIded-jivvclhseazwrjtito">
+      <w:hyperlink w:history="1" r:id="rIdt7ghujw8pg_djfvbdziin">
         <w:r>
           <w:rPr>
             <w:rStyle w:val="Hyperlink"/>
@@ -6896,7 +6992,7 @@
         </w:rPr>
         <w:t xml:space="preserve">Sources: </w:t>
       </w:r>
-      <w:hyperlink w:history="1" r:id="rId7exkwgnjy4o__geksk_uw">
+      <w:hyperlink w:history="1" r:id="rIdfawvr-iij_x5rk4w2vdso">
         <w:r>
           <w:rPr>
             <w:rStyle w:val="Hyperlink"/>
@@ -7031,7 +7127,7 @@
         </w:rPr>
         <w:t xml:space="preserve">Sources: </w:t>
       </w:r>
-      <w:hyperlink w:history="1" r:id="rIdz2ny7rkdutstz9tp0u9hh">
+      <w:hyperlink w:history="1" r:id="rIde2j_arnpyfrjijkxyoibu">
         <w:r>
           <w:rPr>
             <w:rStyle w:val="Hyperlink"/>
@@ -7049,7 +7145,7 @@
         </w:rPr>
         <w:t xml:space="preserve">; </w:t>
       </w:r>
-      <w:hyperlink w:history="1" r:id="rIdlaeoqq2uzpjuxexajadko">
+      <w:hyperlink w:history="1" r:id="rIdh9qedb1dqse5qhkykom4c">
         <w:r>
           <w:rPr>
             <w:rStyle w:val="Hyperlink"/>
@@ -7232,7 +7328,7 @@
         </w:rPr>
         <w:t xml:space="preserve">Sources: </w:t>
       </w:r>
-      <w:hyperlink w:history="1" r:id="rIdkmy8iptupl5kxaarttm4i">
+      <w:hyperlink w:history="1" r:id="rIdiiu2txgkchsn0ugtey40m">
         <w:r>
           <w:rPr>
             <w:rStyle w:val="Hyperlink"/>
@@ -7250,7 +7346,7 @@
         </w:rPr>
         <w:t xml:space="preserve">; </w:t>
       </w:r>
-      <w:hyperlink w:history="1" r:id="rIdhonm5vz1wb26ek1cq4a5i">
+      <w:hyperlink w:history="1" r:id="rIdyi3wil-7lzcgw-olnmjkx">
         <w:r>
           <w:rPr>
             <w:rStyle w:val="Hyperlink"/>
@@ -7268,7 +7364,7 @@
         </w:rPr>
         <w:t xml:space="preserve">; </w:t>
       </w:r>
-      <w:hyperlink w:history="1" r:id="rIdorneyfwxkfrtbex_jzqqf">
+      <w:hyperlink w:history="1" r:id="rIditcgvcwksqn6cl5xnosaz">
         <w:r>
           <w:rPr>
             <w:rStyle w:val="Hyperlink"/>
@@ -7388,7 +7484,7 @@
         </w:rPr>
         <w:t xml:space="preserve">Sources: </w:t>
       </w:r>
-      <w:hyperlink w:history="1" r:id="rIderpzzecalqpyvncijwxcq">
+      <w:hyperlink w:history="1" r:id="rIduphdsirwsgl2p5j_lt-ts">
         <w:r>
           <w:rPr>
             <w:rStyle w:val="Hyperlink"/>
@@ -7406,7 +7502,7 @@
         </w:rPr>
         <w:t xml:space="preserve">; </w:t>
       </w:r>
-      <w:hyperlink w:history="1" r:id="rIdifnysl6nvi46crlgsn2k_">
+      <w:hyperlink w:history="1" r:id="rId-nb0-yl1c_3dniqvnchpb">
         <w:r>
           <w:rPr>
             <w:rStyle w:val="Hyperlink"/>
@@ -7526,7 +7622,7 @@
         </w:rPr>
         <w:t xml:space="preserve">Sources: </w:t>
       </w:r>
-      <w:hyperlink w:history="1" r:id="rId-h52flmstu-irvaeauupi">
+      <w:hyperlink w:history="1" r:id="rId8s5rdmgjqfd7ljmkwjns-">
         <w:r>
           <w:rPr>
             <w:rStyle w:val="Hyperlink"/>
@@ -7544,7 +7640,7 @@
         </w:rPr>
         <w:t xml:space="preserve">; </w:t>
       </w:r>
-      <w:hyperlink w:history="1" r:id="rIdtkddsycqzjeowpbevib-k">
+      <w:hyperlink w:history="1" r:id="rIdog1wrhzry_tlosj6dl1xz">
         <w:r>
           <w:rPr>
             <w:rStyle w:val="Hyperlink"/>
@@ -7666,7 +7762,7 @@
         </w:rPr>
         <w:t xml:space="preserve">Sources: </w:t>
       </w:r>
-      <w:hyperlink w:history="1" r:id="rIdhj0tr1kyhh3hbxjl0r5dt">
+      <w:hyperlink w:history="1" r:id="rIdrs3w2mtxyranaejgrj37y">
         <w:r>
           <w:rPr>
             <w:rStyle w:val="Hyperlink"/>
@@ -7684,7 +7780,7 @@
         </w:rPr>
         <w:t xml:space="preserve">; </w:t>
       </w:r>
-      <w:hyperlink w:history="1" r:id="rIdqsqoybfslheiiizakvyzf">
+      <w:hyperlink w:history="1" r:id="rIdofsxay2ne2mvv-nagqm_w">
         <w:r>
           <w:rPr>
             <w:rStyle w:val="Hyperlink"/>
@@ -7702,7 +7798,7 @@
         </w:rPr>
         <w:t xml:space="preserve">; </w:t>
       </w:r>
-      <w:hyperlink w:history="1" r:id="rIdjv4ibgiaw1x5tp9-kuhl9">
+      <w:hyperlink w:history="1" r:id="rIdtbjzogsmn_c3fil8uemyd">
         <w:r>
           <w:rPr>
             <w:rStyle w:val="Hyperlink"/>
@@ -7807,7 +7903,7 @@
         </w:rPr>
         <w:t xml:space="preserve">Sources: </w:t>
       </w:r>
-      <w:hyperlink w:history="1" r:id="rIdm3wdmr4cu_nnbwuiuat-k">
+      <w:hyperlink w:history="1" r:id="rIdghl0k2fn8clv1zj4nf-fq">
         <w:r>
           <w:rPr>
             <w:rStyle w:val="Hyperlink"/>
@@ -7825,7 +7921,7 @@
         </w:rPr>
         <w:t xml:space="preserve">; </w:t>
       </w:r>
-      <w:hyperlink w:history="1" r:id="rIdu-hp9ywd1tlui5sfsgf7d">
+      <w:hyperlink w:history="1" r:id="rId4f3cvp4umaot46izach5f">
         <w:r>
           <w:rPr>
             <w:rStyle w:val="Hyperlink"/>
@@ -7937,7 +8033,7 @@
         </w:rPr>
         <w:t xml:space="preserve">Sources: </w:t>
       </w:r>
-      <w:hyperlink w:history="1" r:id="rIdl8i5btdxh5giqcoh9e-rs">
+      <w:hyperlink w:history="1" r:id="rIdkbhr4fazgfgipmktvh-qj">
         <w:r>
           <w:rPr>
             <w:rStyle w:val="Hyperlink"/>
@@ -8127,7 +8223,7 @@
         </w:rPr>
         <w:t xml:space="preserve">Sources: </w:t>
       </w:r>
-      <w:hyperlink w:history="1" r:id="rIdot72qck9rjl74tzhwukf_">
+      <w:hyperlink w:history="1" r:id="rIdcww6ennukmaxqb_hqb9ql">
         <w:r>
           <w:rPr>
             <w:rStyle w:val="Hyperlink"/>
@@ -8145,7 +8241,7 @@
         </w:rPr>
         <w:t xml:space="preserve">; </w:t>
       </w:r>
-      <w:hyperlink w:history="1" r:id="rIdzuwjdwc3xj2pl050p9rlw">
+      <w:hyperlink w:history="1" r:id="rIdw5dmxremhywdtj7sk534j">
         <w:r>
           <w:rPr>
             <w:rStyle w:val="Hyperlink"/>
@@ -8163,7 +8259,7 @@
         </w:rPr>
         <w:t xml:space="preserve">; </w:t>
       </w:r>
-      <w:hyperlink w:history="1" r:id="rIdtg4fuyhz-dyyvzrzrgois">
+      <w:hyperlink w:history="1" r:id="rId_cpvpygxgu8zhlo0wvwot">
         <w:r>
           <w:rPr>
             <w:rStyle w:val="Hyperlink"/>
@@ -8181,7 +8277,7 @@
         </w:rPr>
         <w:t xml:space="preserve">; </w:t>
       </w:r>
-      <w:hyperlink w:history="1" r:id="rIdwkdrcl23hnjyqx11m8ron">
+      <w:hyperlink w:history="1" r:id="rIdqunsjorogwvel428o1kv3">
         <w:r>
           <w:rPr>
             <w:rStyle w:val="Hyperlink"/>
@@ -8286,7 +8382,7 @@
         </w:rPr>
         <w:t xml:space="preserve">Sources: </w:t>
       </w:r>
-      <w:hyperlink w:history="1" r:id="rIdljabhy1oxj8hfiyonqron">
+      <w:hyperlink w:history="1" r:id="rIdn5pf5yr1h3nmakxhcxu21">
         <w:r>
           <w:rPr>
             <w:rStyle w:val="Hyperlink"/>
@@ -8304,7 +8400,7 @@
         </w:rPr>
         <w:t xml:space="preserve">; </w:t>
       </w:r>
-      <w:hyperlink w:history="1" r:id="rIdhxyufiqmalguuxazcuhlj">
+      <w:hyperlink w:history="1" r:id="rIdgibo51hhjndd5jfq0sg8z">
         <w:r>
           <w:rPr>
             <w:rStyle w:val="Hyperlink"/>
@@ -8424,7 +8520,7 @@
         </w:rPr>
         <w:t xml:space="preserve">Sources: </w:t>
       </w:r>
-      <w:hyperlink w:history="1" r:id="rId5fuhxq9mbm4kmx_yeifks">
+      <w:hyperlink w:history="1" r:id="rIdo_zfm-qiyuc0tm3aalofr">
         <w:r>
           <w:rPr>
             <w:rStyle w:val="Hyperlink"/>
@@ -8547,7 +8643,7 @@
         </w:rPr>
         <w:t xml:space="preserve">Sources: </w:t>
       </w:r>
-      <w:hyperlink w:history="1" r:id="rIdfhzyvsnul141xp3fxdjc5">
+      <w:hyperlink w:history="1" r:id="rIddancshvkbf5jxlvqlmvco">
         <w:r>
           <w:rPr>
             <w:rStyle w:val="Hyperlink"/>
@@ -8565,7 +8661,7 @@
         </w:rPr>
         <w:t xml:space="preserve">; </w:t>
       </w:r>
-      <w:hyperlink w:history="1" r:id="rIdfq1oemwqcyuae6rf7l8aq">
+      <w:hyperlink w:history="1" r:id="rIdu3syccorw31-tigdtjx0c">
         <w:r>
           <w:rPr>
             <w:rStyle w:val="Hyperlink"/>
@@ -8685,7 +8781,7 @@
         </w:rPr>
         <w:t xml:space="preserve">Sources: </w:t>
       </w:r>
-      <w:hyperlink w:history="1" r:id="rIdj_asjdbdgvzfa4k68atz6">
+      <w:hyperlink w:history="1" r:id="rId4gsjuwqkzpvbocl1mx5lk">
         <w:r>
           <w:rPr>
             <w:rStyle w:val="Hyperlink"/>
@@ -8703,7 +8799,7 @@
         </w:rPr>
         <w:t xml:space="preserve">; </w:t>
       </w:r>
-      <w:hyperlink w:history="1" r:id="rIdxwdvlworvgevaygp9ovtp">
+      <w:hyperlink w:history="1" r:id="rIdecod8vv_u9iyp0etgqivc">
         <w:r>
           <w:rPr>
             <w:rStyle w:val="Hyperlink"/>
@@ -8830,7 +8926,7 @@
         </w:rPr>
         <w:t xml:space="preserve">Sources: </w:t>
       </w:r>
-      <w:hyperlink w:history="1" r:id="rIdfrybo2daigzhebs06crp-">
+      <w:hyperlink w:history="1" r:id="rIdsmsfvag4lzon-culpu18m">
         <w:r>
           <w:rPr>
             <w:rStyle w:val="Hyperlink"/>
@@ -8848,7 +8944,7 @@
         </w:rPr>
         <w:t xml:space="preserve">; </w:t>
       </w:r>
-      <w:hyperlink w:history="1" r:id="rIdlpzk5yg0kbnoci47bzsdx">
+      <w:hyperlink w:history="1" r:id="rIdhigrc1dzkhqr8clk2qgzw">
         <w:r>
           <w:rPr>
             <w:rStyle w:val="Hyperlink"/>
@@ -8968,7 +9064,7 @@
         </w:rPr>
         <w:t xml:space="preserve">Sources: </w:t>
       </w:r>
-      <w:hyperlink w:history="1" r:id="rIdpiitoigtzgkd65_ssnrcj">
+      <w:hyperlink w:history="1" r:id="rIdgvpkft5camlbtdvkp6flf">
         <w:r>
           <w:rPr>
             <w:rStyle w:val="Hyperlink"/>
@@ -9089,7 +9185,7 @@
         </w:rPr>
         <w:t xml:space="preserve">Sources: </w:t>
       </w:r>
-      <w:hyperlink w:history="1" r:id="rIdupjtw64usykbmj1des2ew">
+      <w:hyperlink w:history="1" r:id="rIdhkhpukrllhhmxtewvwzkt">
         <w:r>
           <w:rPr>
             <w:rStyle w:val="Hyperlink"/>
@@ -9209,7 +9305,7 @@
         </w:rPr>
         <w:t xml:space="preserve">Sources: </w:t>
       </w:r>
-      <w:hyperlink w:history="1" r:id="rIdladxk3fvmjg_bp67agdbv">
+      <w:hyperlink w:history="1" r:id="rId-50unp5vttfgqcsnsbfqi">
         <w:r>
           <w:rPr>
             <w:rStyle w:val="Hyperlink"/>
@@ -9227,7 +9323,7 @@
         </w:rPr>
         <w:t xml:space="preserve">; </w:t>
       </w:r>
-      <w:hyperlink w:history="1" r:id="rId4bgt9uwgml3myjj-a9ddv">
+      <w:hyperlink w:history="1" r:id="rIdm4cct3dljgrk8edtk-pie">
         <w:r>
           <w:rPr>
             <w:rStyle w:val="Hyperlink"/>
@@ -9332,7 +9428,7 @@
         </w:rPr>
         <w:t xml:space="preserve">Sources: </w:t>
       </w:r>
-      <w:hyperlink w:history="1" r:id="rIdulzd6naunshhp_uurth-f">
+      <w:hyperlink w:history="1" r:id="rId3zrlk5choxqc7d31aewfu">
         <w:r>
           <w:rPr>
             <w:rStyle w:val="Hyperlink"/>
@@ -9350,7 +9446,7 @@
         </w:rPr>
         <w:t xml:space="preserve">; </w:t>
       </w:r>
-      <w:hyperlink w:history="1" r:id="rIdxk6vbigvk-sj3rptcd-gw">
+      <w:hyperlink w:history="1" r:id="rIdc1rpj8ah2b3002le3ksfo">
         <w:r>
           <w:rPr>
             <w:rStyle w:val="Hyperlink"/>
@@ -9471,7 +9567,7 @@
         </w:rPr>
         <w:t xml:space="preserve">Sources: </w:t>
       </w:r>
-      <w:hyperlink w:history="1" r:id="rIdvshv6rdpocspzjylgor_d">
+      <w:hyperlink w:history="1" r:id="rIdhl3re9tyrdl_u_f2ypnyt">
         <w:r>
           <w:rPr>
             <w:rStyle w:val="Hyperlink"/>
@@ -9489,7 +9585,7 @@
         </w:rPr>
         <w:t xml:space="preserve">; </w:t>
       </w:r>
-      <w:hyperlink w:history="1" r:id="rId6wapz2b0bxmdkgwzkotd8">
+      <w:hyperlink w:history="1" r:id="rIdkhcjl45htootsdiknbpy3">
         <w:r>
           <w:rPr>
             <w:rStyle w:val="Hyperlink"/>
@@ -9610,7 +9706,7 @@
         </w:rPr>
         <w:t xml:space="preserve">Sources: </w:t>
       </w:r>
-      <w:hyperlink w:history="1" r:id="rIdm1mnh9qlbofuspb4rz0wi">
+      <w:hyperlink w:history="1" r:id="rIdhlo2dtwcsaqgkedwnizrh">
         <w:r>
           <w:rPr>
             <w:rStyle w:val="Hyperlink"/>
@@ -9722,7 +9818,7 @@
         </w:rPr>
         <w:t xml:space="preserve">Sources: </w:t>
       </w:r>
-      <w:hyperlink w:history="1" r:id="rIdye54kry4tfqwhlawru-lu">
+      <w:hyperlink w:history="1" r:id="rIdlbt7amozdp5gwqsp0m9bv">
         <w:r>
           <w:rPr>
             <w:rStyle w:val="Hyperlink"/>
@@ -9837,7 +9933,7 @@
         </w:rPr>
         <w:t xml:space="preserve">Sources: </w:t>
       </w:r>
-      <w:hyperlink w:history="1" r:id="rIdimwzzadv670jecsjg5fek">
+      <w:hyperlink w:history="1" r:id="rIdwuzeniwv_6lbj8bknfcy2">
         <w:r>
           <w:rPr>
             <w:rStyle w:val="Hyperlink"/>
@@ -9855,7 +9951,7 @@
         </w:rPr>
         <w:t xml:space="preserve">; </w:t>
       </w:r>
-      <w:hyperlink w:history="1" r:id="rId3ylrwpuxertym6yunkeka">
+      <w:hyperlink w:history="1" r:id="rIdylrbx9pw0cj2mrd8nmkob">
         <w:r>
           <w:rPr>
             <w:rStyle w:val="Hyperlink"/>
@@ -9960,7 +10056,7 @@
         </w:rPr>
         <w:t xml:space="preserve">Sources: </w:t>
       </w:r>
-      <w:hyperlink w:history="1" r:id="rIddgtk6ihsg6yrfypxaflwz">
+      <w:hyperlink w:history="1" r:id="rIdpyj89ktxal23ta_ipdls0">
         <w:r>
           <w:rPr>
             <w:rStyle w:val="Hyperlink"/>
@@ -10111,7 +10207,7 @@
         </w:rPr>
         <w:t xml:space="preserve">Sources: </w:t>
       </w:r>
-      <w:hyperlink w:history="1" r:id="rIdau-pzijldyw3pnlggja2x">
+      <w:hyperlink w:history="1" r:id="rIdsbbmxn9emxyywujeu74tw">
         <w:r>
           <w:rPr>
             <w:rStyle w:val="Hyperlink"/>
@@ -10129,7 +10225,7 @@
         </w:rPr>
         <w:t xml:space="preserve">; </w:t>
       </w:r>
-      <w:hyperlink w:history="1" r:id="rIdqdcgctapsvma4pqmp74qj">
+      <w:hyperlink w:history="1" r:id="rIdbowv4r0p8ra9bsfj5bqvh">
         <w:r>
           <w:rPr>
             <w:rStyle w:val="Hyperlink"/>
@@ -10241,7 +10337,7 @@
         </w:rPr>
         <w:t xml:space="preserve">Sources: </w:t>
       </w:r>
-      <w:hyperlink w:history="1" r:id="rIduia4i2ejxgjcjytei-q8x">
+      <w:hyperlink w:history="1" r:id="rIdtg6uwwr91g6mqdeisuvpc">
         <w:r>
           <w:rPr>
             <w:rStyle w:val="Hyperlink"/>
@@ -10442,7 +10538,7 @@
         </w:rPr>
         <w:t xml:space="preserve">Sources: </w:t>
       </w:r>
-      <w:hyperlink w:history="1" r:id="rIdtbfrxk8f7bcloqphnfkze">
+      <w:hyperlink w:history="1" r:id="rId7yocgg_vfpvq61xtz1pgg">
         <w:r>
           <w:rPr>
             <w:rStyle w:val="Hyperlink"/>
@@ -10547,7 +10643,7 @@
         </w:rPr>
         <w:t xml:space="preserve">Sources: </w:t>
       </w:r>
-      <w:hyperlink w:history="1" r:id="rIdfvimvh6bmjse8b8wud0d4">
+      <w:hyperlink w:history="1" r:id="rId4dwviwobibmgkdgx-qp9_">
         <w:r>
           <w:rPr>
             <w:rStyle w:val="Hyperlink"/>
@@ -10565,7 +10661,7 @@
         </w:rPr>
         <w:t xml:space="preserve">; </w:t>
       </w:r>
-      <w:hyperlink w:history="1" r:id="rIddu7wv_lab82897ee1qqaf">
+      <w:hyperlink w:history="1" r:id="rId7avem0h4p0aa8thgjwhuz">
         <w:r>
           <w:rPr>
             <w:rStyle w:val="Hyperlink"/>
@@ -10670,7 +10766,7 @@
         </w:rPr>
         <w:t xml:space="preserve">Sources: </w:t>
       </w:r>
-      <w:hyperlink w:history="1" r:id="rId5lweo1xxsdlevfot-ra8m">
+      <w:hyperlink w:history="1" r:id="rIdkjufz3dw6eircz6zmnmxy">
         <w:r>
           <w:rPr>
             <w:rStyle w:val="Hyperlink"/>
@@ -10775,7 +10871,7 @@
         </w:rPr>
         <w:t xml:space="preserve">Sources: </w:t>
       </w:r>
-      <w:hyperlink w:history="1" r:id="rIdyphbme0zy2y_zqui_pcwo">
+      <w:hyperlink w:history="1" r:id="rIdh0xgdwt9_tbkg_z482elp">
         <w:r>
           <w:rPr>
             <w:rStyle w:val="Hyperlink"/>
@@ -10880,7 +10976,7 @@
         </w:rPr>
         <w:t xml:space="preserve">Sources: </w:t>
       </w:r>
-      <w:hyperlink w:history="1" r:id="rIdplthhg5kvix_pvmj9cfwo">
+      <w:hyperlink w:history="1" r:id="rId2dxahdiarmz162hunsbre">
         <w:r>
           <w:rPr>
             <w:rStyle w:val="Hyperlink"/>
@@ -10898,7 +10994,7 @@
         </w:rPr>
         <w:t xml:space="preserve">; </w:t>
       </w:r>
-      <w:hyperlink w:history="1" r:id="rIdcqn6v34tto3xmhptebga7">
+      <w:hyperlink w:history="1" r:id="rIdiffovx5elll7ef5o__wd4">
         <w:r>
           <w:rPr>
             <w:rStyle w:val="Hyperlink"/>
@@ -11003,7 +11099,7 @@
         </w:rPr>
         <w:t xml:space="preserve">Sources: </w:t>
       </w:r>
-      <w:hyperlink w:history="1" r:id="rIdbidrgstnlcrcdr8znn0im">
+      <w:hyperlink w:history="1" r:id="rIdgrey21z-hpbhfg2r5rn5-">
         <w:r>
           <w:rPr>
             <w:rStyle w:val="Hyperlink"/>
@@ -11108,7 +11204,7 @@
         </w:rPr>
         <w:t xml:space="preserve">Sources: </w:t>
       </w:r>
-      <w:hyperlink w:history="1" r:id="rIdfyn5b97nlpx4m54l4w439">
+      <w:hyperlink w:history="1" r:id="rId9rc0nytkcolhpzd8edcl9">
         <w:r>
           <w:rPr>
             <w:rStyle w:val="Hyperlink"/>
@@ -11213,7 +11309,7 @@
         </w:rPr>
         <w:t xml:space="preserve">Sources: </w:t>
       </w:r>
-      <w:hyperlink w:history="1" r:id="rIdru0j1tmawtyiwyp2lhrn-">
+      <w:hyperlink w:history="1" r:id="rIdhhd_djvapzdbhkfl-dygk">
         <w:r>
           <w:rPr>
             <w:rStyle w:val="Hyperlink"/>
@@ -11231,7 +11327,7 @@
         </w:rPr>
         <w:t xml:space="preserve">; </w:t>
       </w:r>
-      <w:hyperlink w:history="1" r:id="rIddmtljx2foe59fzuoo1kpw">
+      <w:hyperlink w:history="1" r:id="rIdvf2sdqpdtkvpqd6al0m1e">
         <w:r>
           <w:rPr>
             <w:rStyle w:val="Hyperlink"/>
@@ -11449,7 +11545,7 @@
         </w:rPr>
         <w:t xml:space="preserve">Sources: </w:t>
       </w:r>
-      <w:hyperlink w:history="1" r:id="rIdnij2y0japzqgddhnlpqfp">
+      <w:hyperlink w:history="1" r:id="rIdmemhlcw55mrpn-8nyysxj">
         <w:r>
           <w:rPr>
             <w:rStyle w:val="Hyperlink"/>
@@ -11467,7 +11563,7 @@
         </w:rPr>
         <w:t xml:space="preserve">; </w:t>
       </w:r>
-      <w:hyperlink w:history="1" r:id="rIdwyfvl292bo2lajszi80qe">
+      <w:hyperlink w:history="1" r:id="rIdlggghgg8pjajhbpbesjwn">
         <w:r>
           <w:rPr>
             <w:rStyle w:val="Hyperlink"/>
@@ -11485,7 +11581,7 @@
         </w:rPr>
         <w:t xml:space="preserve">; </w:t>
       </w:r>
-      <w:hyperlink w:history="1" r:id="rIduzbeqlbwlmgbxucvmhc-f">
+      <w:hyperlink w:history="1" r:id="rIdg-0bhw08juutabudehedl">
         <w:r>
           <w:rPr>
             <w:rStyle w:val="Hyperlink"/>
@@ -11503,7 +11599,7 @@
         </w:rPr>
         <w:t xml:space="preserve">; </w:t>
       </w:r>
-      <w:hyperlink w:history="1" r:id="rIdnmkyhn4-cbnqvyhsmmavj">
+      <w:hyperlink w:history="1" r:id="rIddvsmpne11udk21yft426b">
         <w:r>
           <w:rPr>
             <w:rStyle w:val="Hyperlink"/>
@@ -11676,7 +11772,7 @@
             <w:pPr>
               <w:spacing w:after="40"/>
             </w:pPr>
-            <w:hyperlink w:history="1" r:id="rIdkh8nwtahm9si0rcthn4ia">
+            <w:hyperlink w:history="1" r:id="rIdy4dfpju1jx0sans-lhkle">
               <w:r>
                 <w:rPr>
                   <w:rStyle w:val="Hyperlink"/>
@@ -11771,7 +11867,7 @@
             <w:pPr>
               <w:spacing w:after="40"/>
             </w:pPr>
-            <w:hyperlink w:history="1" r:id="rIdukue-futwdmrp93myctms">
+            <w:hyperlink w:history="1" r:id="rIdpksrj55brtco_jxak_si3">
               <w:r>
                 <w:rPr>
                   <w:rStyle w:val="Hyperlink"/>
@@ -11866,7 +11962,7 @@
             <w:pPr>
               <w:spacing w:after="40"/>
             </w:pPr>
-            <w:hyperlink w:history="1" r:id="rIdfh2jqewrhuixfyt2o4_va">
+            <w:hyperlink w:history="1" r:id="rIdtxvlxro-q7m1dwlgddvg4">
               <w:r>
                 <w:rPr>
                   <w:rStyle w:val="Hyperlink"/>
@@ -11961,7 +12057,7 @@
             <w:pPr>
               <w:spacing w:after="40"/>
             </w:pPr>
-            <w:hyperlink w:history="1" r:id="rId8kgy1-bcdtbbu_3kieuam">
+            <w:hyperlink w:history="1" r:id="rId3lmotqilt8d47ubfmho0k">
               <w:r>
                 <w:rPr>
                   <w:rStyle w:val="Hyperlink"/>
@@ -12056,7 +12152,7 @@
             <w:pPr>
               <w:spacing w:after="40"/>
             </w:pPr>
-            <w:hyperlink w:history="1" r:id="rIdjcjfls22ilrhtzyf8d2bw">
+            <w:hyperlink w:history="1" r:id="rIdhz52wgiipmecvw6sizj7a">
               <w:r>
                 <w:rPr>
                   <w:rStyle w:val="Hyperlink"/>
@@ -12151,7 +12247,7 @@
             <w:pPr>
               <w:spacing w:after="40"/>
             </w:pPr>
-            <w:hyperlink w:history="1" r:id="rIdpgqi8ssz_rnyz2-nlk_ai">
+            <w:hyperlink w:history="1" r:id="rIdgclwpncnoll66i_jexpng">
               <w:r>
                 <w:rPr>
                   <w:rStyle w:val="Hyperlink"/>
@@ -12246,7 +12342,7 @@
             <w:pPr>
               <w:spacing w:after="40"/>
             </w:pPr>
-            <w:hyperlink w:history="1" r:id="rId1yuyxthjewgstut9vd6rg">
+            <w:hyperlink w:history="1" r:id="rId0gk7ft68whdwpn9gzfst6">
               <w:r>
                 <w:rPr>
                   <w:rStyle w:val="Hyperlink"/>
@@ -12341,7 +12437,7 @@
             <w:pPr>
               <w:spacing w:after="40"/>
             </w:pPr>
-            <w:hyperlink w:history="1" r:id="rIdunlb_imaj6ltfekt2vg_w">
+            <w:hyperlink w:history="1" r:id="rIdrmnlglyclvmtwjgmnyejh">
               <w:r>
                 <w:rPr>
                   <w:rStyle w:val="Hyperlink"/>
@@ -12436,7 +12532,7 @@
             <w:pPr>
               <w:spacing w:after="40"/>
             </w:pPr>
-            <w:hyperlink w:history="1" r:id="rIdrepaf51a-_gffpdv-n1i1">
+            <w:hyperlink w:history="1" r:id="rIduxg-lvmd1nh28dopxl0y1">
               <w:r>
                 <w:rPr>
                   <w:rStyle w:val="Hyperlink"/>
@@ -12531,7 +12627,7 @@
             <w:pPr>
               <w:spacing w:after="40"/>
             </w:pPr>
-            <w:hyperlink w:history="1" r:id="rIdlj1cnmwnluwiuwiarykf8">
+            <w:hyperlink w:history="1" r:id="rIdukvcpmtsg2srvqtnvndpp">
               <w:r>
                 <w:rPr>
                   <w:rStyle w:val="Hyperlink"/>
@@ -13019,6 +13115,2001 @@
         <w:pageBreakBefore/>
       </w:pPr>
       <w:r>
+        <w:t xml:space="preserve">Appendix D. Where each linked file is in this package</w:t>
+      </w:r>
+    </w:p>
+    <w:p>
+      <w:pPr>
+        <w:spacing w:after="120" w:line="276"/>
+      </w:pPr>
+      <w:r>
+        <w:t xml:space="preserve">Every source link in this document is to a file at a fixed commit. The same file is in the package at the path below. Commit links point to the dated commit record, 05_Evidence/CONCEPTION_RECORD.txt.</w:t>
+      </w:r>
+    </w:p>
+    <w:tbl>
+      <w:tblPr>
+        <w:tblW w:type="dxa" w:w="9720"/>
+        <w:tblBorders>
+          <w:top w:val="single" w:color="auto" w:sz="4"/>
+          <w:left w:val="single" w:color="auto" w:sz="4"/>
+          <w:bottom w:val="single" w:color="auto" w:sz="4"/>
+          <w:right w:val="single" w:color="auto" w:sz="4"/>
+          <w:insideH w:val="single" w:color="auto" w:sz="4"/>
+          <w:insideV w:val="single" w:color="auto" w:sz="4"/>
+        </w:tblBorders>
+      </w:tblPr>
+      <w:tblGrid>
+        <w:gridCol w:w="3600"/>
+        <w:gridCol w:w="6120"/>
+      </w:tblGrid>
+      <w:tr>
+        <w:trPr>
+          <w:tblHeader/>
+        </w:trPr>
+        <w:tc>
+          <w:tcPr>
+            <w:tcW w:type="dxa" w:w="3600"/>
+            <w:tcBorders>
+              <w:top w:val="single" w:color="BFBFBF" w:sz="4"/>
+              <w:left w:val="single" w:color="BFBFBF" w:sz="4"/>
+              <w:bottom w:val="single" w:color="BFBFBF" w:sz="4"/>
+              <w:right w:val="single" w:color="BFBFBF" w:sz="4"/>
+            </w:tcBorders>
+            <w:shd w:fill="1F3A5F" w:color="auto" w:val="clear"/>
+            <w:tcMar>
+              <w:top w:type="dxa" w:w="60"/>
+              <w:left w:type="dxa" w:w="100"/>
+              <w:bottom w:type="dxa" w:w="60"/>
+              <w:right w:type="dxa" w:w="100"/>
+            </w:tcMar>
+          </w:tcPr>
+          <w:p>
+            <w:pPr>
+              <w:spacing w:after="40"/>
+            </w:pPr>
+            <w:r>
+              <w:rPr>
+                <w:b/>
+                <w:bCs/>
+                <w:color w:val="FFFFFF"/>
+                <w:sz w:val="19"/>
+                <w:szCs w:val="19"/>
+              </w:rPr>
+              <w:t xml:space="preserve">Linked as</w:t>
+            </w:r>
+          </w:p>
+        </w:tc>
+        <w:tc>
+          <w:tcPr>
+            <w:tcW w:type="dxa" w:w="6120"/>
+            <w:tcBorders>
+              <w:top w:val="single" w:color="BFBFBF" w:sz="4"/>
+              <w:left w:val="single" w:color="BFBFBF" w:sz="4"/>
+              <w:bottom w:val="single" w:color="BFBFBF" w:sz="4"/>
+              <w:right w:val="single" w:color="BFBFBF" w:sz="4"/>
+            </w:tcBorders>
+            <w:shd w:fill="1F3A5F" w:color="auto" w:val="clear"/>
+            <w:tcMar>
+              <w:top w:type="dxa" w:w="60"/>
+              <w:left w:type="dxa" w:w="100"/>
+              <w:bottom w:type="dxa" w:w="60"/>
+              <w:right w:type="dxa" w:w="100"/>
+            </w:tcMar>
+          </w:tcPr>
+          <w:p>
+            <w:pPr>
+              <w:spacing w:after="40"/>
+            </w:pPr>
+            <w:r>
+              <w:rPr>
+                <w:b/>
+                <w:bCs/>
+                <w:color w:val="FFFFFF"/>
+                <w:sz w:val="19"/>
+                <w:szCs w:val="19"/>
+              </w:rPr>
+              <w:t xml:space="preserve">Path in the package</w:t>
+            </w:r>
+          </w:p>
+        </w:tc>
+      </w:tr>
+      <w:tr>
+        <w:trPr>
+          <w:tblHeader w:val="false"/>
+        </w:trPr>
+        <w:tc>
+          <w:tcPr>
+            <w:tcW w:type="dxa" w:w="3600"/>
+            <w:tcBorders>
+              <w:top w:val="single" w:color="BFBFBF" w:sz="4"/>
+              <w:left w:val="single" w:color="BFBFBF" w:sz="4"/>
+              <w:bottom w:val="single" w:color="BFBFBF" w:sz="4"/>
+              <w:right w:val="single" w:color="BFBFBF" w:sz="4"/>
+            </w:tcBorders>
+            <w:tcMar>
+              <w:top w:type="dxa" w:w="60"/>
+              <w:left w:type="dxa" w:w="100"/>
+              <w:bottom w:type="dxa" w:w="60"/>
+              <w:right w:type="dxa" w:w="100"/>
+            </w:tcMar>
+          </w:tcPr>
+          <w:p>
+            <w:pPr>
+              <w:spacing w:after="40"/>
+            </w:pPr>
+            <w:r>
+              <w:rPr>
+                <w:sz w:val="19"/>
+                <w:szCs w:val="19"/>
+              </w:rPr>
+              <w:t xml:space="preserve">CLAIMS.md</w:t>
+            </w:r>
+          </w:p>
+        </w:tc>
+        <w:tc>
+          <w:tcPr>
+            <w:tcW w:type="dxa" w:w="6120"/>
+            <w:tcBorders>
+              <w:top w:val="single" w:color="BFBFBF" w:sz="4"/>
+              <w:left w:val="single" w:color="BFBFBF" w:sz="4"/>
+              <w:bottom w:val="single" w:color="BFBFBF" w:sz="4"/>
+              <w:right w:val="single" w:color="BFBFBF" w:sz="4"/>
+            </w:tcBorders>
+            <w:tcMar>
+              <w:top w:type="dxa" w:w="60"/>
+              <w:left w:type="dxa" w:w="100"/>
+              <w:bottom w:type="dxa" w:w="60"/>
+              <w:right w:type="dxa" w:w="100"/>
+            </w:tcMar>
+          </w:tcPr>
+          <w:p>
+            <w:pPr>
+              <w:spacing w:after="40"/>
+            </w:pPr>
+            <w:r>
+              <w:rPr>
+                <w:sz w:val="19"/>
+                <w:szCs w:val="19"/>
+              </w:rPr>
+              <w:t xml:space="preserve">02_Draft_Provisional/CLAIMS.md</w:t>
+            </w:r>
+          </w:p>
+        </w:tc>
+      </w:tr>
+      <w:tr>
+        <w:trPr>
+          <w:tblHeader w:val="false"/>
+        </w:trPr>
+        <w:tc>
+          <w:tcPr>
+            <w:tcW w:type="dxa" w:w="3600"/>
+            <w:tcBorders>
+              <w:top w:val="single" w:color="BFBFBF" w:sz="4"/>
+              <w:left w:val="single" w:color="BFBFBF" w:sz="4"/>
+              <w:bottom w:val="single" w:color="BFBFBF" w:sz="4"/>
+              <w:right w:val="single" w:color="BFBFBF" w:sz="4"/>
+            </w:tcBorders>
+            <w:tcMar>
+              <w:top w:type="dxa" w:w="60"/>
+              <w:left w:type="dxa" w:w="100"/>
+              <w:bottom w:type="dxa" w:w="60"/>
+              <w:right w:type="dxa" w:w="100"/>
+            </w:tcMar>
+          </w:tcPr>
+          <w:p>
+            <w:pPr>
+              <w:spacing w:after="40"/>
+            </w:pPr>
+            <w:r>
+              <w:rPr>
+                <w:sz w:val="19"/>
+                <w:szCs w:val="19"/>
+              </w:rPr>
+              <w:t xml:space="preserve">SPECIFICATION.md</w:t>
+            </w:r>
+          </w:p>
+        </w:tc>
+        <w:tc>
+          <w:tcPr>
+            <w:tcW w:type="dxa" w:w="6120"/>
+            <w:tcBorders>
+              <w:top w:val="single" w:color="BFBFBF" w:sz="4"/>
+              <w:left w:val="single" w:color="BFBFBF" w:sz="4"/>
+              <w:bottom w:val="single" w:color="BFBFBF" w:sz="4"/>
+              <w:right w:val="single" w:color="BFBFBF" w:sz="4"/>
+            </w:tcBorders>
+            <w:tcMar>
+              <w:top w:type="dxa" w:w="60"/>
+              <w:left w:type="dxa" w:w="100"/>
+              <w:bottom w:type="dxa" w:w="60"/>
+              <w:right w:type="dxa" w:w="100"/>
+            </w:tcMar>
+          </w:tcPr>
+          <w:p>
+            <w:pPr>
+              <w:spacing w:after="40"/>
+            </w:pPr>
+            <w:r>
+              <w:rPr>
+                <w:sz w:val="19"/>
+                <w:szCs w:val="19"/>
+              </w:rPr>
+              <w:t xml:space="preserve">02_Draft_Provisional/SPECIFICATION.md</w:t>
+            </w:r>
+          </w:p>
+        </w:tc>
+      </w:tr>
+      <w:tr>
+        <w:trPr>
+          <w:tblHeader w:val="false"/>
+        </w:trPr>
+        <w:tc>
+          <w:tcPr>
+            <w:tcW w:type="dxa" w:w="3600"/>
+            <w:tcBorders>
+              <w:top w:val="single" w:color="BFBFBF" w:sz="4"/>
+              <w:left w:val="single" w:color="BFBFBF" w:sz="4"/>
+              <w:bottom w:val="single" w:color="BFBFBF" w:sz="4"/>
+              <w:right w:val="single" w:color="BFBFBF" w:sz="4"/>
+            </w:tcBorders>
+            <w:tcMar>
+              <w:top w:type="dxa" w:w="60"/>
+              <w:left w:type="dxa" w:w="100"/>
+              <w:bottom w:type="dxa" w:w="60"/>
+              <w:right w:type="dxa" w:w="100"/>
+            </w:tcMar>
+          </w:tcPr>
+          <w:p>
+            <w:pPr>
+              <w:spacing w:after="40"/>
+            </w:pPr>
+            <w:r>
+              <w:rPr>
+                <w:sz w:val="19"/>
+                <w:szCs w:val="19"/>
+              </w:rPr>
+              <w:t xml:space="preserve">DISCLOSURE_MEMO.md</w:t>
+            </w:r>
+          </w:p>
+        </w:tc>
+        <w:tc>
+          <w:tcPr>
+            <w:tcW w:type="dxa" w:w="6120"/>
+            <w:tcBorders>
+              <w:top w:val="single" w:color="BFBFBF" w:sz="4"/>
+              <w:left w:val="single" w:color="BFBFBF" w:sz="4"/>
+              <w:bottom w:val="single" w:color="BFBFBF" w:sz="4"/>
+              <w:right w:val="single" w:color="BFBFBF" w:sz="4"/>
+            </w:tcBorders>
+            <w:tcMar>
+              <w:top w:type="dxa" w:w="60"/>
+              <w:left w:type="dxa" w:w="100"/>
+              <w:bottom w:type="dxa" w:w="60"/>
+              <w:right w:type="dxa" w:w="100"/>
+            </w:tcMar>
+          </w:tcPr>
+          <w:p>
+            <w:pPr>
+              <w:spacing w:after="40"/>
+            </w:pPr>
+            <w:r>
+              <w:rPr>
+                <w:sz w:val="19"/>
+                <w:szCs w:val="19"/>
+              </w:rPr>
+              <w:t xml:space="preserve">03_Disclosure_Records/DISCLOSURE_MEMO.md</w:t>
+            </w:r>
+          </w:p>
+        </w:tc>
+      </w:tr>
+      <w:tr>
+        <w:trPr>
+          <w:tblHeader w:val="false"/>
+        </w:trPr>
+        <w:tc>
+          <w:tcPr>
+            <w:tcW w:type="dxa" w:w="3600"/>
+            <w:tcBorders>
+              <w:top w:val="single" w:color="BFBFBF" w:sz="4"/>
+              <w:left w:val="single" w:color="BFBFBF" w:sz="4"/>
+              <w:bottom w:val="single" w:color="BFBFBF" w:sz="4"/>
+              <w:right w:val="single" w:color="BFBFBF" w:sz="4"/>
+            </w:tcBorders>
+            <w:tcMar>
+              <w:top w:type="dxa" w:w="60"/>
+              <w:left w:type="dxa" w:w="100"/>
+              <w:bottom w:type="dxa" w:w="60"/>
+              <w:right w:type="dxa" w:w="100"/>
+            </w:tcMar>
+          </w:tcPr>
+          <w:p>
+            <w:pPr>
+              <w:spacing w:after="40"/>
+            </w:pPr>
+            <w:r>
+              <w:rPr>
+                <w:sz w:val="19"/>
+                <w:szCs w:val="19"/>
+              </w:rPr>
+              <w:t xml:space="preserve">GUIDED_ACQUISITION.md</w:t>
+            </w:r>
+          </w:p>
+        </w:tc>
+        <w:tc>
+          <w:tcPr>
+            <w:tcW w:type="dxa" w:w="6120"/>
+            <w:tcBorders>
+              <w:top w:val="single" w:color="BFBFBF" w:sz="4"/>
+              <w:left w:val="single" w:color="BFBFBF" w:sz="4"/>
+              <w:bottom w:val="single" w:color="BFBFBF" w:sz="4"/>
+              <w:right w:val="single" w:color="BFBFBF" w:sz="4"/>
+            </w:tcBorders>
+            <w:tcMar>
+              <w:top w:type="dxa" w:w="60"/>
+              <w:left w:type="dxa" w:w="100"/>
+              <w:bottom w:type="dxa" w:w="60"/>
+              <w:right w:type="dxa" w:w="100"/>
+            </w:tcMar>
+          </w:tcPr>
+          <w:p>
+            <w:pPr>
+              <w:spacing w:after="40"/>
+            </w:pPr>
+            <w:r>
+              <w:rPr>
+                <w:sz w:val="19"/>
+                <w:szCs w:val="19"/>
+              </w:rPr>
+              <w:t xml:space="preserve">03_Disclosure_Records/GUIDED_ACQUISITION.md</w:t>
+            </w:r>
+          </w:p>
+        </w:tc>
+      </w:tr>
+      <w:tr>
+        <w:trPr>
+          <w:tblHeader w:val="false"/>
+        </w:trPr>
+        <w:tc>
+          <w:tcPr>
+            <w:tcW w:type="dxa" w:w="3600"/>
+            <w:tcBorders>
+              <w:top w:val="single" w:color="BFBFBF" w:sz="4"/>
+              <w:left w:val="single" w:color="BFBFBF" w:sz="4"/>
+              <w:bottom w:val="single" w:color="BFBFBF" w:sz="4"/>
+              <w:right w:val="single" w:color="BFBFBF" w:sz="4"/>
+            </w:tcBorders>
+            <w:tcMar>
+              <w:top w:type="dxa" w:w="60"/>
+              <w:left w:type="dxa" w:w="100"/>
+              <w:bottom w:type="dxa" w:w="60"/>
+              <w:right w:type="dxa" w:w="100"/>
+            </w:tcMar>
+          </w:tcPr>
+          <w:p>
+            <w:pPr>
+              <w:spacing w:after="40"/>
+            </w:pPr>
+            <w:r>
+              <w:rPr>
+                <w:sz w:val="19"/>
+                <w:szCs w:val="19"/>
+              </w:rPr>
+              <w:t xml:space="preserve">INVENTION_DISCLOSURE.md</w:t>
+            </w:r>
+          </w:p>
+        </w:tc>
+        <w:tc>
+          <w:tcPr>
+            <w:tcW w:type="dxa" w:w="6120"/>
+            <w:tcBorders>
+              <w:top w:val="single" w:color="BFBFBF" w:sz="4"/>
+              <w:left w:val="single" w:color="BFBFBF" w:sz="4"/>
+              <w:bottom w:val="single" w:color="BFBFBF" w:sz="4"/>
+              <w:right w:val="single" w:color="BFBFBF" w:sz="4"/>
+            </w:tcBorders>
+            <w:tcMar>
+              <w:top w:type="dxa" w:w="60"/>
+              <w:left w:type="dxa" w:w="100"/>
+              <w:bottom w:type="dxa" w:w="60"/>
+              <w:right w:type="dxa" w:w="100"/>
+            </w:tcMar>
+          </w:tcPr>
+          <w:p>
+            <w:pPr>
+              <w:spacing w:after="40"/>
+            </w:pPr>
+            <w:r>
+              <w:rPr>
+                <w:sz w:val="19"/>
+                <w:szCs w:val="19"/>
+              </w:rPr>
+              <w:t xml:space="preserve">03_Disclosure_Records/INVENTION_DISCLOSURE.md</w:t>
+            </w:r>
+          </w:p>
+        </w:tc>
+      </w:tr>
+      <w:tr>
+        <w:trPr>
+          <w:tblHeader w:val="false"/>
+        </w:trPr>
+        <w:tc>
+          <w:tcPr>
+            <w:tcW w:type="dxa" w:w="3600"/>
+            <w:tcBorders>
+              <w:top w:val="single" w:color="BFBFBF" w:sz="4"/>
+              <w:left w:val="single" w:color="BFBFBF" w:sz="4"/>
+              <w:bottom w:val="single" w:color="BFBFBF" w:sz="4"/>
+              <w:right w:val="single" w:color="BFBFBF" w:sz="4"/>
+            </w:tcBorders>
+            <w:tcMar>
+              <w:top w:type="dxa" w:w="60"/>
+              <w:left w:type="dxa" w:w="100"/>
+              <w:bottom w:type="dxa" w:w="60"/>
+              <w:right w:type="dxa" w:w="100"/>
+            </w:tcMar>
+          </w:tcPr>
+          <w:p>
+            <w:pPr>
+              <w:spacing w:after="40"/>
+            </w:pPr>
+            <w:r>
+              <w:rPr>
+                <w:sz w:val="19"/>
+                <w:szCs w:val="19"/>
+              </w:rPr>
+              <w:t xml:space="preserve">SCRUB_PLAN.md</w:t>
+            </w:r>
+          </w:p>
+        </w:tc>
+        <w:tc>
+          <w:tcPr>
+            <w:tcW w:type="dxa" w:w="6120"/>
+            <w:tcBorders>
+              <w:top w:val="single" w:color="BFBFBF" w:sz="4"/>
+              <w:left w:val="single" w:color="BFBFBF" w:sz="4"/>
+              <w:bottom w:val="single" w:color="BFBFBF" w:sz="4"/>
+              <w:right w:val="single" w:color="BFBFBF" w:sz="4"/>
+            </w:tcBorders>
+            <w:tcMar>
+              <w:top w:type="dxa" w:w="60"/>
+              <w:left w:type="dxa" w:w="100"/>
+              <w:bottom w:type="dxa" w:w="60"/>
+              <w:right w:type="dxa" w:w="100"/>
+            </w:tcMar>
+          </w:tcPr>
+          <w:p>
+            <w:pPr>
+              <w:spacing w:after="40"/>
+            </w:pPr>
+            <w:r>
+              <w:rPr>
+                <w:sz w:val="19"/>
+                <w:szCs w:val="19"/>
+              </w:rPr>
+              <w:t xml:space="preserve">03_Disclosure_Records/SCRUB_PLAN.md</w:t>
+            </w:r>
+          </w:p>
+        </w:tc>
+      </w:tr>
+      <w:tr>
+        <w:trPr>
+          <w:tblHeader w:val="false"/>
+        </w:trPr>
+        <w:tc>
+          <w:tcPr>
+            <w:tcW w:type="dxa" w:w="3600"/>
+            <w:tcBorders>
+              <w:top w:val="single" w:color="BFBFBF" w:sz="4"/>
+              <w:left w:val="single" w:color="BFBFBF" w:sz="4"/>
+              <w:bottom w:val="single" w:color="BFBFBF" w:sz="4"/>
+              <w:right w:val="single" w:color="BFBFBF" w:sz="4"/>
+            </w:tcBorders>
+            <w:tcMar>
+              <w:top w:type="dxa" w:w="60"/>
+              <w:left w:type="dxa" w:w="100"/>
+              <w:bottom w:type="dxa" w:w="60"/>
+              <w:right w:type="dxa" w:w="100"/>
+            </w:tcMar>
+          </w:tcPr>
+          <w:p>
+            <w:pPr>
+              <w:spacing w:after="40"/>
+            </w:pPr>
+            <w:r>
+              <w:rPr>
+                <w:sz w:val="19"/>
+                <w:szCs w:val="19"/>
+              </w:rPr>
+              <w:t xml:space="preserve">00_README_for_TTO.md</w:t>
+            </w:r>
+          </w:p>
+        </w:tc>
+        <w:tc>
+          <w:tcPr>
+            <w:tcW w:type="dxa" w:w="6120"/>
+            <w:tcBorders>
+              <w:top w:val="single" w:color="BFBFBF" w:sz="4"/>
+              <w:left w:val="single" w:color="BFBFBF" w:sz="4"/>
+              <w:bottom w:val="single" w:color="BFBFBF" w:sz="4"/>
+              <w:right w:val="single" w:color="BFBFBF" w:sz="4"/>
+            </w:tcBorders>
+            <w:tcMar>
+              <w:top w:type="dxa" w:w="60"/>
+              <w:left w:type="dxa" w:w="100"/>
+              <w:bottom w:type="dxa" w:w="60"/>
+              <w:right w:type="dxa" w:w="100"/>
+            </w:tcMar>
+          </w:tcPr>
+          <w:p>
+            <w:pPr>
+              <w:spacing w:after="40"/>
+            </w:pPr>
+            <w:r>
+              <w:rPr>
+                <w:sz w:val="19"/>
+                <w:szCs w:val="19"/>
+              </w:rPr>
+              <w:t xml:space="preserve">04_WSU_TTO_Package/00_README_for_TTO.md</w:t>
+            </w:r>
+          </w:p>
+        </w:tc>
+      </w:tr>
+      <w:tr>
+        <w:trPr>
+          <w:tblHeader w:val="false"/>
+        </w:trPr>
+        <w:tc>
+          <w:tcPr>
+            <w:tcW w:type="dxa" w:w="3600"/>
+            <w:tcBorders>
+              <w:top w:val="single" w:color="BFBFBF" w:sz="4"/>
+              <w:left w:val="single" w:color="BFBFBF" w:sz="4"/>
+              <w:bottom w:val="single" w:color="BFBFBF" w:sz="4"/>
+              <w:right w:val="single" w:color="BFBFBF" w:sz="4"/>
+            </w:tcBorders>
+            <w:tcMar>
+              <w:top w:type="dxa" w:w="60"/>
+              <w:left w:type="dxa" w:w="100"/>
+              <w:bottom w:type="dxa" w:w="60"/>
+              <w:right w:type="dxa" w:w="100"/>
+            </w:tcMar>
+          </w:tcPr>
+          <w:p>
+            <w:pPr>
+              <w:spacing w:after="40"/>
+            </w:pPr>
+            <w:r>
+              <w:rPr>
+                <w:sz w:val="19"/>
+                <w:szCs w:val="19"/>
+              </w:rPr>
+              <w:t xml:space="preserve">06_disclosure_timeline.md</w:t>
+            </w:r>
+          </w:p>
+        </w:tc>
+        <w:tc>
+          <w:tcPr>
+            <w:tcW w:type="dxa" w:w="6120"/>
+            <w:tcBorders>
+              <w:top w:val="single" w:color="BFBFBF" w:sz="4"/>
+              <w:left w:val="single" w:color="BFBFBF" w:sz="4"/>
+              <w:bottom w:val="single" w:color="BFBFBF" w:sz="4"/>
+              <w:right w:val="single" w:color="BFBFBF" w:sz="4"/>
+            </w:tcBorders>
+            <w:tcMar>
+              <w:top w:type="dxa" w:w="60"/>
+              <w:left w:type="dxa" w:w="100"/>
+              <w:bottom w:type="dxa" w:w="60"/>
+              <w:right w:type="dxa" w:w="100"/>
+            </w:tcMar>
+          </w:tcPr>
+          <w:p>
+            <w:pPr>
+              <w:spacing w:after="40"/>
+            </w:pPr>
+            <w:r>
+              <w:rPr>
+                <w:sz w:val="19"/>
+                <w:szCs w:val="19"/>
+              </w:rPr>
+              <w:t xml:space="preserve">04_WSU_TTO_Package/06_disclosure_timeline.md</w:t>
+            </w:r>
+          </w:p>
+        </w:tc>
+      </w:tr>
+      <w:tr>
+        <w:trPr>
+          <w:tblHeader w:val="false"/>
+        </w:trPr>
+        <w:tc>
+          <w:tcPr>
+            <w:tcW w:type="dxa" w:w="3600"/>
+            <w:tcBorders>
+              <w:top w:val="single" w:color="BFBFBF" w:sz="4"/>
+              <w:left w:val="single" w:color="BFBFBF" w:sz="4"/>
+              <w:bottom w:val="single" w:color="BFBFBF" w:sz="4"/>
+              <w:right w:val="single" w:color="BFBFBF" w:sz="4"/>
+            </w:tcBorders>
+            <w:tcMar>
+              <w:top w:type="dxa" w:w="60"/>
+              <w:left w:type="dxa" w:w="100"/>
+              <w:bottom w:type="dxa" w:w="60"/>
+              <w:right w:type="dxa" w:w="100"/>
+            </w:tcMar>
+          </w:tcPr>
+          <w:p>
+            <w:pPr>
+              <w:spacing w:after="40"/>
+            </w:pPr>
+            <w:r>
+              <w:rPr>
+                <w:sz w:val="19"/>
+                <w:szCs w:val="19"/>
+              </w:rPr>
+              <w:t xml:space="preserve">drr-row-spacing-defect.md</w:t>
+            </w:r>
+          </w:p>
+        </w:tc>
+        <w:tc>
+          <w:tcPr>
+            <w:tcW w:type="dxa" w:w="6120"/>
+            <w:tcBorders>
+              <w:top w:val="single" w:color="BFBFBF" w:sz="4"/>
+              <w:left w:val="single" w:color="BFBFBF" w:sz="4"/>
+              <w:bottom w:val="single" w:color="BFBFBF" w:sz="4"/>
+              <w:right w:val="single" w:color="BFBFBF" w:sz="4"/>
+            </w:tcBorders>
+            <w:tcMar>
+              <w:top w:type="dxa" w:w="60"/>
+              <w:left w:type="dxa" w:w="100"/>
+              <w:bottom w:type="dxa" w:w="60"/>
+              <w:right w:type="dxa" w:w="100"/>
+            </w:tcMar>
+          </w:tcPr>
+          <w:p>
+            <w:pPr>
+              <w:spacing w:after="40"/>
+            </w:pPr>
+            <w:r>
+              <w:rPr>
+                <w:sz w:val="19"/>
+                <w:szCs w:val="19"/>
+              </w:rPr>
+              <w:t xml:space="preserve">05_Evidence/spine-program/01_carm_level_detection/docs/handoff/context/drr-row-spacing-defect.md</w:t>
+            </w:r>
+          </w:p>
+        </w:tc>
+      </w:tr>
+      <w:tr>
+        <w:trPr>
+          <w:tblHeader w:val="false"/>
+        </w:trPr>
+        <w:tc>
+          <w:tcPr>
+            <w:tcW w:type="dxa" w:w="3600"/>
+            <w:tcBorders>
+              <w:top w:val="single" w:color="BFBFBF" w:sz="4"/>
+              <w:left w:val="single" w:color="BFBFBF" w:sz="4"/>
+              <w:bottom w:val="single" w:color="BFBFBF" w:sz="4"/>
+              <w:right w:val="single" w:color="BFBFBF" w:sz="4"/>
+            </w:tcBorders>
+            <w:tcMar>
+              <w:top w:type="dxa" w:w="60"/>
+              <w:left w:type="dxa" w:w="100"/>
+              <w:bottom w:type="dxa" w:w="60"/>
+              <w:right w:type="dxa" w:w="100"/>
+            </w:tcMar>
+          </w:tcPr>
+          <w:p>
+            <w:pPr>
+              <w:spacing w:after="40"/>
+            </w:pPr>
+            <w:r>
+              <w:rPr>
+                <w:sz w:val="19"/>
+                <w:szCs w:val="19"/>
+              </w:rPr>
+              <w:t xml:space="preserve">selective-prediction-the-honest-99.md</w:t>
+            </w:r>
+          </w:p>
+        </w:tc>
+        <w:tc>
+          <w:tcPr>
+            <w:tcW w:type="dxa" w:w="6120"/>
+            <w:tcBorders>
+              <w:top w:val="single" w:color="BFBFBF" w:sz="4"/>
+              <w:left w:val="single" w:color="BFBFBF" w:sz="4"/>
+              <w:bottom w:val="single" w:color="BFBFBF" w:sz="4"/>
+              <w:right w:val="single" w:color="BFBFBF" w:sz="4"/>
+            </w:tcBorders>
+            <w:tcMar>
+              <w:top w:type="dxa" w:w="60"/>
+              <w:left w:type="dxa" w:w="100"/>
+              <w:bottom w:type="dxa" w:w="60"/>
+              <w:right w:type="dxa" w:w="100"/>
+            </w:tcMar>
+          </w:tcPr>
+          <w:p>
+            <w:pPr>
+              <w:spacing w:after="40"/>
+            </w:pPr>
+            <w:r>
+              <w:rPr>
+                <w:sz w:val="19"/>
+                <w:szCs w:val="19"/>
+              </w:rPr>
+              <w:t xml:space="preserve">05_Evidence/spine-program/01_carm_level_detection/docs/handoff/context/selective-prediction-the-honest-99.md</w:t>
+            </w:r>
+          </w:p>
+        </w:tc>
+      </w:tr>
+      <w:tr>
+        <w:trPr>
+          <w:tblHeader w:val="false"/>
+        </w:trPr>
+        <w:tc>
+          <w:tcPr>
+            <w:tcW w:type="dxa" w:w="3600"/>
+            <w:tcBorders>
+              <w:top w:val="single" w:color="BFBFBF" w:sz="4"/>
+              <w:left w:val="single" w:color="BFBFBF" w:sz="4"/>
+              <w:bottom w:val="single" w:color="BFBFBF" w:sz="4"/>
+              <w:right w:val="single" w:color="BFBFBF" w:sz="4"/>
+            </w:tcBorders>
+            <w:tcMar>
+              <w:top w:type="dxa" w:w="60"/>
+              <w:left w:type="dxa" w:w="100"/>
+              <w:bottom w:type="dxa" w:w="60"/>
+              <w:right w:type="dxa" w:w="100"/>
+            </w:tcMar>
+          </w:tcPr>
+          <w:p>
+            <w:pPr>
+              <w:spacing w:after="40"/>
+            </w:pPr>
+            <w:r>
+              <w:rPr>
+                <w:sz w:val="19"/>
+                <w:szCs w:val="19"/>
+              </w:rPr>
+              <w:t xml:space="preserve">sweep-map-replaces-registration.md</w:t>
+            </w:r>
+          </w:p>
+        </w:tc>
+        <w:tc>
+          <w:tcPr>
+            <w:tcW w:type="dxa" w:w="6120"/>
+            <w:tcBorders>
+              <w:top w:val="single" w:color="BFBFBF" w:sz="4"/>
+              <w:left w:val="single" w:color="BFBFBF" w:sz="4"/>
+              <w:bottom w:val="single" w:color="BFBFBF" w:sz="4"/>
+              <w:right w:val="single" w:color="BFBFBF" w:sz="4"/>
+            </w:tcBorders>
+            <w:tcMar>
+              <w:top w:type="dxa" w:w="60"/>
+              <w:left w:type="dxa" w:w="100"/>
+              <w:bottom w:type="dxa" w:w="60"/>
+              <w:right w:type="dxa" w:w="100"/>
+            </w:tcMar>
+          </w:tcPr>
+          <w:p>
+            <w:pPr>
+              <w:spacing w:after="40"/>
+            </w:pPr>
+            <w:r>
+              <w:rPr>
+                <w:sz w:val="19"/>
+                <w:szCs w:val="19"/>
+              </w:rPr>
+              <w:t xml:space="preserve">05_Evidence/spine-program/01_carm_level_detection/docs/handoff/context/sweep-map-replaces-registration.md</w:t>
+            </w:r>
+          </w:p>
+        </w:tc>
+      </w:tr>
+      <w:tr>
+        <w:trPr>
+          <w:tblHeader w:val="false"/>
+        </w:trPr>
+        <w:tc>
+          <w:tcPr>
+            <w:tcW w:type="dxa" w:w="3600"/>
+            <w:tcBorders>
+              <w:top w:val="single" w:color="BFBFBF" w:sz="4"/>
+              <w:left w:val="single" w:color="BFBFBF" w:sz="4"/>
+              <w:bottom w:val="single" w:color="BFBFBF" w:sz="4"/>
+              <w:right w:val="single" w:color="BFBFBF" w:sz="4"/>
+            </w:tcBorders>
+            <w:tcMar>
+              <w:top w:type="dxa" w:w="60"/>
+              <w:left w:type="dxa" w:w="100"/>
+              <w:bottom w:type="dxa" w:w="60"/>
+              <w:right w:type="dxa" w:w="100"/>
+            </w:tcMar>
+          </w:tcPr>
+          <w:p>
+            <w:pPr>
+              <w:spacing w:after="40"/>
+            </w:pPr>
+            <w:r>
+              <w:rPr>
+                <w:sz w:val="19"/>
+                <w:szCs w:val="19"/>
+              </w:rPr>
+              <w:t xml:space="preserve">RESULTS_CATALOG.md</w:t>
+            </w:r>
+          </w:p>
+        </w:tc>
+        <w:tc>
+          <w:tcPr>
+            <w:tcW w:type="dxa" w:w="6120"/>
+            <w:tcBorders>
+              <w:top w:val="single" w:color="BFBFBF" w:sz="4"/>
+              <w:left w:val="single" w:color="BFBFBF" w:sz="4"/>
+              <w:bottom w:val="single" w:color="BFBFBF" w:sz="4"/>
+              <w:right w:val="single" w:color="BFBFBF" w:sz="4"/>
+            </w:tcBorders>
+            <w:tcMar>
+              <w:top w:type="dxa" w:w="60"/>
+              <w:left w:type="dxa" w:w="100"/>
+              <w:bottom w:type="dxa" w:w="60"/>
+              <w:right w:type="dxa" w:w="100"/>
+            </w:tcMar>
+          </w:tcPr>
+          <w:p>
+            <w:pPr>
+              <w:spacing w:after="40"/>
+            </w:pPr>
+            <w:r>
+              <w:rPr>
+                <w:sz w:val="19"/>
+                <w:szCs w:val="19"/>
+              </w:rPr>
+              <w:t xml:space="preserve">05_Evidence/spine-program/01_carm_level_detection/docs/handoff/RESULTS_CATALOG.md</w:t>
+            </w:r>
+          </w:p>
+        </w:tc>
+      </w:tr>
+      <w:tr>
+        <w:trPr>
+          <w:tblHeader w:val="false"/>
+        </w:trPr>
+        <w:tc>
+          <w:tcPr>
+            <w:tcW w:type="dxa" w:w="3600"/>
+            <w:tcBorders>
+              <w:top w:val="single" w:color="BFBFBF" w:sz="4"/>
+              <w:left w:val="single" w:color="BFBFBF" w:sz="4"/>
+              <w:bottom w:val="single" w:color="BFBFBF" w:sz="4"/>
+              <w:right w:val="single" w:color="BFBFBF" w:sz="4"/>
+            </w:tcBorders>
+            <w:tcMar>
+              <w:top w:type="dxa" w:w="60"/>
+              <w:left w:type="dxa" w:w="100"/>
+              <w:bottom w:type="dxa" w:w="60"/>
+              <w:right w:type="dxa" w:w="100"/>
+            </w:tcMar>
+          </w:tcPr>
+          <w:p>
+            <w:pPr>
+              <w:spacing w:after="40"/>
+            </w:pPr>
+            <w:r>
+              <w:rPr>
+                <w:sz w:val="19"/>
+                <w:szCs w:val="19"/>
+              </w:rPr>
+              <w:t xml:space="preserve">01 STATUS.md</w:t>
+            </w:r>
+          </w:p>
+        </w:tc>
+        <w:tc>
+          <w:tcPr>
+            <w:tcW w:type="dxa" w:w="6120"/>
+            <w:tcBorders>
+              <w:top w:val="single" w:color="BFBFBF" w:sz="4"/>
+              <w:left w:val="single" w:color="BFBFBF" w:sz="4"/>
+              <w:bottom w:val="single" w:color="BFBFBF" w:sz="4"/>
+              <w:right w:val="single" w:color="BFBFBF" w:sz="4"/>
+            </w:tcBorders>
+            <w:tcMar>
+              <w:top w:type="dxa" w:w="60"/>
+              <w:left w:type="dxa" w:w="100"/>
+              <w:bottom w:type="dxa" w:w="60"/>
+              <w:right w:type="dxa" w:w="100"/>
+            </w:tcMar>
+          </w:tcPr>
+          <w:p>
+            <w:pPr>
+              <w:spacing w:after="40"/>
+            </w:pPr>
+            <w:r>
+              <w:rPr>
+                <w:sz w:val="19"/>
+                <w:szCs w:val="19"/>
+              </w:rPr>
+              <w:t xml:space="preserve">05_Evidence/spine-program/01_carm_level_detection/STATUS.md</w:t>
+            </w:r>
+          </w:p>
+        </w:tc>
+      </w:tr>
+      <w:tr>
+        <w:trPr>
+          <w:tblHeader w:val="false"/>
+        </w:trPr>
+        <w:tc>
+          <w:tcPr>
+            <w:tcW w:type="dxa" w:w="3600"/>
+            <w:tcBorders>
+              <w:top w:val="single" w:color="BFBFBF" w:sz="4"/>
+              <w:left w:val="single" w:color="BFBFBF" w:sz="4"/>
+              <w:bottom w:val="single" w:color="BFBFBF" w:sz="4"/>
+              <w:right w:val="single" w:color="BFBFBF" w:sz="4"/>
+            </w:tcBorders>
+            <w:tcMar>
+              <w:top w:type="dxa" w:w="60"/>
+              <w:left w:type="dxa" w:w="100"/>
+              <w:bottom w:type="dxa" w:w="60"/>
+              <w:right w:type="dxa" w:w="100"/>
+            </w:tcMar>
+          </w:tcPr>
+          <w:p>
+            <w:pPr>
+              <w:spacing w:after="40"/>
+            </w:pPr>
+            <w:r>
+              <w:rPr>
+                <w:sz w:val="19"/>
+                <w:szCs w:val="19"/>
+              </w:rPr>
+              <w:t xml:space="preserve">01 TODO.md</w:t>
+            </w:r>
+          </w:p>
+        </w:tc>
+        <w:tc>
+          <w:tcPr>
+            <w:tcW w:type="dxa" w:w="6120"/>
+            <w:tcBorders>
+              <w:top w:val="single" w:color="BFBFBF" w:sz="4"/>
+              <w:left w:val="single" w:color="BFBFBF" w:sz="4"/>
+              <w:bottom w:val="single" w:color="BFBFBF" w:sz="4"/>
+              <w:right w:val="single" w:color="BFBFBF" w:sz="4"/>
+            </w:tcBorders>
+            <w:tcMar>
+              <w:top w:type="dxa" w:w="60"/>
+              <w:left w:type="dxa" w:w="100"/>
+              <w:bottom w:type="dxa" w:w="60"/>
+              <w:right w:type="dxa" w:w="100"/>
+            </w:tcMar>
+          </w:tcPr>
+          <w:p>
+            <w:pPr>
+              <w:spacing w:after="40"/>
+            </w:pPr>
+            <w:r>
+              <w:rPr>
+                <w:sz w:val="19"/>
+                <w:szCs w:val="19"/>
+              </w:rPr>
+              <w:t xml:space="preserve">05_Evidence/spine-program/01_carm_level_detection/TODO.md</w:t>
+            </w:r>
+          </w:p>
+        </w:tc>
+      </w:tr>
+      <w:tr>
+        <w:trPr>
+          <w:tblHeader w:val="false"/>
+        </w:trPr>
+        <w:tc>
+          <w:tcPr>
+            <w:tcW w:type="dxa" w:w="3600"/>
+            <w:tcBorders>
+              <w:top w:val="single" w:color="BFBFBF" w:sz="4"/>
+              <w:left w:val="single" w:color="BFBFBF" w:sz="4"/>
+              <w:bottom w:val="single" w:color="BFBFBF" w:sz="4"/>
+              <w:right w:val="single" w:color="BFBFBF" w:sz="4"/>
+            </w:tcBorders>
+            <w:tcMar>
+              <w:top w:type="dxa" w:w="60"/>
+              <w:left w:type="dxa" w:w="100"/>
+              <w:bottom w:type="dxa" w:w="60"/>
+              <w:right w:type="dxa" w:w="100"/>
+            </w:tcMar>
+          </w:tcPr>
+          <w:p>
+            <w:pPr>
+              <w:spacing w:after="40"/>
+            </w:pPr>
+            <w:r>
+              <w:rPr>
+                <w:sz w:val="19"/>
+                <w:szCs w:val="19"/>
+              </w:rPr>
+              <w:t xml:space="preserve">CT_LSTV_CLASSIFIER_PLAN.md</w:t>
+            </w:r>
+          </w:p>
+        </w:tc>
+        <w:tc>
+          <w:tcPr>
+            <w:tcW w:type="dxa" w:w="6120"/>
+            <w:tcBorders>
+              <w:top w:val="single" w:color="BFBFBF" w:sz="4"/>
+              <w:left w:val="single" w:color="BFBFBF" w:sz="4"/>
+              <w:bottom w:val="single" w:color="BFBFBF" w:sz="4"/>
+              <w:right w:val="single" w:color="BFBFBF" w:sz="4"/>
+            </w:tcBorders>
+            <w:tcMar>
+              <w:top w:type="dxa" w:w="60"/>
+              <w:left w:type="dxa" w:w="100"/>
+              <w:bottom w:type="dxa" w:w="60"/>
+              <w:right w:type="dxa" w:w="100"/>
+            </w:tcMar>
+          </w:tcPr>
+          <w:p>
+            <w:pPr>
+              <w:spacing w:after="40"/>
+            </w:pPr>
+            <w:r>
+              <w:rPr>
+                <w:sz w:val="19"/>
+                <w:szCs w:val="19"/>
+              </w:rPr>
+              <w:t xml:space="preserve">05_Evidence/spine-program/06_transitional_ct_census/docs/CT_LSTV_CLASSIFIER_PLAN.md</w:t>
+            </w:r>
+          </w:p>
+        </w:tc>
+      </w:tr>
+      <w:tr>
+        <w:trPr>
+          <w:tblHeader w:val="false"/>
+        </w:trPr>
+        <w:tc>
+          <w:tcPr>
+            <w:tcW w:type="dxa" w:w="3600"/>
+            <w:tcBorders>
+              <w:top w:val="single" w:color="BFBFBF" w:sz="4"/>
+              <w:left w:val="single" w:color="BFBFBF" w:sz="4"/>
+              <w:bottom w:val="single" w:color="BFBFBF" w:sz="4"/>
+              <w:right w:val="single" w:color="BFBFBF" w:sz="4"/>
+            </w:tcBorders>
+            <w:tcMar>
+              <w:top w:type="dxa" w:w="60"/>
+              <w:left w:type="dxa" w:w="100"/>
+              <w:bottom w:type="dxa" w:w="60"/>
+              <w:right w:type="dxa" w:w="100"/>
+            </w:tcMar>
+          </w:tcPr>
+          <w:p>
+            <w:pPr>
+              <w:spacing w:after="40"/>
+            </w:pPr>
+            <w:r>
+              <w:rPr>
+                <w:sz w:val="19"/>
+                <w:szCs w:val="19"/>
+              </w:rPr>
+              <w:t xml:space="preserve">CLASSIFIERS.md</w:t>
+            </w:r>
+          </w:p>
+        </w:tc>
+        <w:tc>
+          <w:tcPr>
+            <w:tcW w:type="dxa" w:w="6120"/>
+            <w:tcBorders>
+              <w:top w:val="single" w:color="BFBFBF" w:sz="4"/>
+              <w:left w:val="single" w:color="BFBFBF" w:sz="4"/>
+              <w:bottom w:val="single" w:color="BFBFBF" w:sz="4"/>
+              <w:right w:val="single" w:color="BFBFBF" w:sz="4"/>
+            </w:tcBorders>
+            <w:tcMar>
+              <w:top w:type="dxa" w:w="60"/>
+              <w:left w:type="dxa" w:w="100"/>
+              <w:bottom w:type="dxa" w:w="60"/>
+              <w:right w:type="dxa" w:w="100"/>
+            </w:tcMar>
+          </w:tcPr>
+          <w:p>
+            <w:pPr>
+              <w:spacing w:after="40"/>
+            </w:pPr>
+            <w:r>
+              <w:rPr>
+                <w:sz w:val="19"/>
+                <w:szCs w:val="19"/>
+              </w:rPr>
+              <w:t xml:space="preserve">05_Evidence/spine-program/06_transitional_ct_census/docs/ruleclass/CLASSIFIERS.md</w:t>
+            </w:r>
+          </w:p>
+        </w:tc>
+      </w:tr>
+      <w:tr>
+        <w:trPr>
+          <w:tblHeader w:val="false"/>
+        </w:trPr>
+        <w:tc>
+          <w:tcPr>
+            <w:tcW w:type="dxa" w:w="3600"/>
+            <w:tcBorders>
+              <w:top w:val="single" w:color="BFBFBF" w:sz="4"/>
+              <w:left w:val="single" w:color="BFBFBF" w:sz="4"/>
+              <w:bottom w:val="single" w:color="BFBFBF" w:sz="4"/>
+              <w:right w:val="single" w:color="BFBFBF" w:sz="4"/>
+            </w:tcBorders>
+            <w:tcMar>
+              <w:top w:type="dxa" w:w="60"/>
+              <w:left w:type="dxa" w:w="100"/>
+              <w:bottom w:type="dxa" w:w="60"/>
+              <w:right w:type="dxa" w:w="100"/>
+            </w:tcMar>
+          </w:tcPr>
+          <w:p>
+            <w:pPr>
+              <w:spacing w:after="40"/>
+            </w:pPr>
+            <w:r>
+              <w:rPr>
+                <w:sz w:val="19"/>
+                <w:szCs w:val="19"/>
+              </w:rPr>
+              <w:t xml:space="preserve">WRONG_LEVEL_COST_EVIDENCE.md</w:t>
+            </w:r>
+          </w:p>
+        </w:tc>
+        <w:tc>
+          <w:tcPr>
+            <w:tcW w:type="dxa" w:w="6120"/>
+            <w:tcBorders>
+              <w:top w:val="single" w:color="BFBFBF" w:sz="4"/>
+              <w:left w:val="single" w:color="BFBFBF" w:sz="4"/>
+              <w:bottom w:val="single" w:color="BFBFBF" w:sz="4"/>
+              <w:right w:val="single" w:color="BFBFBF" w:sz="4"/>
+            </w:tcBorders>
+            <w:tcMar>
+              <w:top w:type="dxa" w:w="60"/>
+              <w:left w:type="dxa" w:w="100"/>
+              <w:bottom w:type="dxa" w:w="60"/>
+              <w:right w:type="dxa" w:w="100"/>
+            </w:tcMar>
+          </w:tcPr>
+          <w:p>
+            <w:pPr>
+              <w:spacing w:after="40"/>
+            </w:pPr>
+            <w:r>
+              <w:rPr>
+                <w:sz w:val="19"/>
+                <w:szCs w:val="19"/>
+              </w:rPr>
+              <w:t xml:space="preserve">05_Evidence/spine-program/09_wrong_level_clinical_qi/docs/WRONG_LEVEL_COST_EVIDENCE.md</w:t>
+            </w:r>
+          </w:p>
+        </w:tc>
+      </w:tr>
+      <w:tr>
+        <w:trPr>
+          <w:tblHeader w:val="false"/>
+        </w:trPr>
+        <w:tc>
+          <w:tcPr>
+            <w:tcW w:type="dxa" w:w="3600"/>
+            <w:tcBorders>
+              <w:top w:val="single" w:color="BFBFBF" w:sz="4"/>
+              <w:left w:val="single" w:color="BFBFBF" w:sz="4"/>
+              <w:bottom w:val="single" w:color="BFBFBF" w:sz="4"/>
+              <w:right w:val="single" w:color="BFBFBF" w:sz="4"/>
+            </w:tcBorders>
+            <w:tcMar>
+              <w:top w:type="dxa" w:w="60"/>
+              <w:left w:type="dxa" w:w="100"/>
+              <w:bottom w:type="dxa" w:w="60"/>
+              <w:right w:type="dxa" w:w="100"/>
+            </w:tcMar>
+          </w:tcPr>
+          <w:p>
+            <w:pPr>
+              <w:spacing w:after="40"/>
+            </w:pPr>
+            <w:r>
+              <w:rPr>
+                <w:sz w:val="19"/>
+                <w:szCs w:val="19"/>
+              </w:rPr>
+              <w:t xml:space="preserve">COUNTING_EVIDENCE.md</w:t>
+            </w:r>
+          </w:p>
+        </w:tc>
+        <w:tc>
+          <w:tcPr>
+            <w:tcW w:type="dxa" w:w="6120"/>
+            <w:tcBorders>
+              <w:top w:val="single" w:color="BFBFBF" w:sz="4"/>
+              <w:left w:val="single" w:color="BFBFBF" w:sz="4"/>
+              <w:bottom w:val="single" w:color="BFBFBF" w:sz="4"/>
+              <w:right w:val="single" w:color="BFBFBF" w:sz="4"/>
+            </w:tcBorders>
+            <w:tcMar>
+              <w:top w:type="dxa" w:w="60"/>
+              <w:left w:type="dxa" w:w="100"/>
+              <w:bottom w:type="dxa" w:w="60"/>
+              <w:right w:type="dxa" w:w="100"/>
+            </w:tcMar>
+          </w:tcPr>
+          <w:p>
+            <w:pPr>
+              <w:spacing w:after="40"/>
+            </w:pPr>
+            <w:r>
+              <w:rPr>
+                <w:sz w:val="19"/>
+                <w:szCs w:val="19"/>
+              </w:rPr>
+              <w:t xml:space="preserve">05_Evidence/spinesurg-ct-nnunet/docs/COUNTING_EVIDENCE.md</w:t>
+            </w:r>
+          </w:p>
+        </w:tc>
+      </w:tr>
+      <w:tr>
+        <w:trPr>
+          <w:tblHeader w:val="false"/>
+        </w:trPr>
+        <w:tc>
+          <w:tcPr>
+            <w:tcW w:type="dxa" w:w="3600"/>
+            <w:tcBorders>
+              <w:top w:val="single" w:color="BFBFBF" w:sz="4"/>
+              <w:left w:val="single" w:color="BFBFBF" w:sz="4"/>
+              <w:bottom w:val="single" w:color="BFBFBF" w:sz="4"/>
+              <w:right w:val="single" w:color="BFBFBF" w:sz="4"/>
+            </w:tcBorders>
+            <w:tcMar>
+              <w:top w:type="dxa" w:w="60"/>
+              <w:left w:type="dxa" w:w="100"/>
+              <w:bottom w:type="dxa" w:w="60"/>
+              <w:right w:type="dxa" w:w="100"/>
+            </w:tcMar>
+          </w:tcPr>
+          <w:p>
+            <w:pPr>
+              <w:spacing w:after="40"/>
+            </w:pPr>
+            <w:r>
+              <w:rPr>
+                <w:sz w:val="19"/>
+                <w:szCs w:val="19"/>
+              </w:rPr>
+              <w:t xml:space="preserve">SX-Stitch_request.md</w:t>
+            </w:r>
+          </w:p>
+        </w:tc>
+        <w:tc>
+          <w:tcPr>
+            <w:tcW w:type="dxa" w:w="6120"/>
+            <w:tcBorders>
+              <w:top w:val="single" w:color="BFBFBF" w:sz="4"/>
+              <w:left w:val="single" w:color="BFBFBF" w:sz="4"/>
+              <w:bottom w:val="single" w:color="BFBFBF" w:sz="4"/>
+              <w:right w:val="single" w:color="BFBFBF" w:sz="4"/>
+            </w:tcBorders>
+            <w:tcMar>
+              <w:top w:type="dxa" w:w="60"/>
+              <w:left w:type="dxa" w:w="100"/>
+              <w:bottom w:type="dxa" w:w="60"/>
+              <w:right w:type="dxa" w:w="100"/>
+            </w:tcMar>
+          </w:tcPr>
+          <w:p>
+            <w:pPr>
+              <w:spacing w:after="40"/>
+            </w:pPr>
+            <w:r>
+              <w:rPr>
+                <w:sz w:val="19"/>
+                <w:szCs w:val="19"/>
+              </w:rPr>
+              <w:t xml:space="preserve">05_Evidence/spinesurg-ct-nnunet/docs/data_requests/SX-Stitch_request.md</w:t>
+            </w:r>
+          </w:p>
+        </w:tc>
+      </w:tr>
+      <w:tr>
+        <w:trPr>
+          <w:tblHeader w:val="false"/>
+        </w:trPr>
+        <w:tc>
+          <w:tcPr>
+            <w:tcW w:type="dxa" w:w="3600"/>
+            <w:tcBorders>
+              <w:top w:val="single" w:color="BFBFBF" w:sz="4"/>
+              <w:left w:val="single" w:color="BFBFBF" w:sz="4"/>
+              <w:bottom w:val="single" w:color="BFBFBF" w:sz="4"/>
+              <w:right w:val="single" w:color="BFBFBF" w:sz="4"/>
+            </w:tcBorders>
+            <w:tcMar>
+              <w:top w:type="dxa" w:w="60"/>
+              <w:left w:type="dxa" w:w="100"/>
+              <w:bottom w:type="dxa" w:w="60"/>
+              <w:right w:type="dxa" w:w="100"/>
+            </w:tcMar>
+          </w:tcPr>
+          <w:p>
+            <w:pPr>
+              <w:spacing w:after="40"/>
+            </w:pPr>
+            <w:r>
+              <w:rPr>
+                <w:sz w:val="19"/>
+                <w:szCs w:val="19"/>
+              </w:rPr>
+              <w:t xml:space="preserve">GUIDED_ACQUISITION.md</w:t>
+            </w:r>
+          </w:p>
+        </w:tc>
+        <w:tc>
+          <w:tcPr>
+            <w:tcW w:type="dxa" w:w="6120"/>
+            <w:tcBorders>
+              <w:top w:val="single" w:color="BFBFBF" w:sz="4"/>
+              <w:left w:val="single" w:color="BFBFBF" w:sz="4"/>
+              <w:bottom w:val="single" w:color="BFBFBF" w:sz="4"/>
+              <w:right w:val="single" w:color="BFBFBF" w:sz="4"/>
+            </w:tcBorders>
+            <w:tcMar>
+              <w:top w:type="dxa" w:w="60"/>
+              <w:left w:type="dxa" w:w="100"/>
+              <w:bottom w:type="dxa" w:w="60"/>
+              <w:right w:type="dxa" w:w="100"/>
+            </w:tcMar>
+          </w:tcPr>
+          <w:p>
+            <w:pPr>
+              <w:spacing w:after="40"/>
+            </w:pPr>
+            <w:r>
+              <w:rPr>
+                <w:sz w:val="19"/>
+                <w:szCs w:val="19"/>
+              </w:rPr>
+              <w:t xml:space="preserve">05_Evidence/spinesurg-ct-nnunet/docs/GUIDED_ACQUISITION.md</w:t>
+            </w:r>
+          </w:p>
+        </w:tc>
+      </w:tr>
+      <w:tr>
+        <w:trPr>
+          <w:tblHeader w:val="false"/>
+        </w:trPr>
+        <w:tc>
+          <w:tcPr>
+            <w:tcW w:type="dxa" w:w="3600"/>
+            <w:tcBorders>
+              <w:top w:val="single" w:color="BFBFBF" w:sz="4"/>
+              <w:left w:val="single" w:color="BFBFBF" w:sz="4"/>
+              <w:bottom w:val="single" w:color="BFBFBF" w:sz="4"/>
+              <w:right w:val="single" w:color="BFBFBF" w:sz="4"/>
+            </w:tcBorders>
+            <w:tcMar>
+              <w:top w:type="dxa" w:w="60"/>
+              <w:left w:type="dxa" w:w="100"/>
+              <w:bottom w:type="dxa" w:w="60"/>
+              <w:right w:type="dxa" w:w="100"/>
+            </w:tcMar>
+          </w:tcPr>
+          <w:p>
+            <w:pPr>
+              <w:spacing w:after="40"/>
+            </w:pPr>
+            <w:r>
+              <w:rPr>
+                <w:sz w:val="19"/>
+                <w:szCs w:val="19"/>
+              </w:rPr>
+              <w:t xml:space="preserve">HANDOFF_PHYSICS.md</w:t>
+            </w:r>
+          </w:p>
+        </w:tc>
+        <w:tc>
+          <w:tcPr>
+            <w:tcW w:type="dxa" w:w="6120"/>
+            <w:tcBorders>
+              <w:top w:val="single" w:color="BFBFBF" w:sz="4"/>
+              <w:left w:val="single" w:color="BFBFBF" w:sz="4"/>
+              <w:bottom w:val="single" w:color="BFBFBF" w:sz="4"/>
+              <w:right w:val="single" w:color="BFBFBF" w:sz="4"/>
+            </w:tcBorders>
+            <w:tcMar>
+              <w:top w:type="dxa" w:w="60"/>
+              <w:left w:type="dxa" w:w="100"/>
+              <w:bottom w:type="dxa" w:w="60"/>
+              <w:right w:type="dxa" w:w="100"/>
+            </w:tcMar>
+          </w:tcPr>
+          <w:p>
+            <w:pPr>
+              <w:spacing w:after="40"/>
+            </w:pPr>
+            <w:r>
+              <w:rPr>
+                <w:sz w:val="19"/>
+                <w:szCs w:val="19"/>
+              </w:rPr>
+              <w:t xml:space="preserve">05_Evidence/spinesurg-ct-nnunet/docs/HANDOFF_PHYSICS.md</w:t>
+            </w:r>
+          </w:p>
+        </w:tc>
+      </w:tr>
+      <w:tr>
+        <w:trPr>
+          <w:tblHeader w:val="false"/>
+        </w:trPr>
+        <w:tc>
+          <w:tcPr>
+            <w:tcW w:type="dxa" w:w="3600"/>
+            <w:tcBorders>
+              <w:top w:val="single" w:color="BFBFBF" w:sz="4"/>
+              <w:left w:val="single" w:color="BFBFBF" w:sz="4"/>
+              <w:bottom w:val="single" w:color="BFBFBF" w:sz="4"/>
+              <w:right w:val="single" w:color="BFBFBF" w:sz="4"/>
+            </w:tcBorders>
+            <w:tcMar>
+              <w:top w:type="dxa" w:w="60"/>
+              <w:left w:type="dxa" w:w="100"/>
+              <w:bottom w:type="dxa" w:w="60"/>
+              <w:right w:type="dxa" w:w="100"/>
+            </w:tcMar>
+          </w:tcPr>
+          <w:p>
+            <w:pPr>
+              <w:spacing w:after="40"/>
+            </w:pPr>
+            <w:r>
+              <w:rPr>
+                <w:sz w:val="19"/>
+                <w:szCs w:val="19"/>
+              </w:rPr>
+              <w:t xml:space="preserve">INVENTION_DISCLOSURE.md</w:t>
+            </w:r>
+          </w:p>
+        </w:tc>
+        <w:tc>
+          <w:tcPr>
+            <w:tcW w:type="dxa" w:w="6120"/>
+            <w:tcBorders>
+              <w:top w:val="single" w:color="BFBFBF" w:sz="4"/>
+              <w:left w:val="single" w:color="BFBFBF" w:sz="4"/>
+              <w:bottom w:val="single" w:color="BFBFBF" w:sz="4"/>
+              <w:right w:val="single" w:color="BFBFBF" w:sz="4"/>
+            </w:tcBorders>
+            <w:tcMar>
+              <w:top w:type="dxa" w:w="60"/>
+              <w:left w:type="dxa" w:w="100"/>
+              <w:bottom w:type="dxa" w:w="60"/>
+              <w:right w:type="dxa" w:w="100"/>
+            </w:tcMar>
+          </w:tcPr>
+          <w:p>
+            <w:pPr>
+              <w:spacing w:after="40"/>
+            </w:pPr>
+            <w:r>
+              <w:rPr>
+                <w:sz w:val="19"/>
+                <w:szCs w:val="19"/>
+              </w:rPr>
+              <w:t xml:space="preserve">05_Evidence/spinesurg-ct-nnunet/docs/INVENTION_DISCLOSURE.md</w:t>
+            </w:r>
+          </w:p>
+        </w:tc>
+      </w:tr>
+      <w:tr>
+        <w:trPr>
+          <w:tblHeader w:val="false"/>
+        </w:trPr>
+        <w:tc>
+          <w:tcPr>
+            <w:tcW w:type="dxa" w:w="3600"/>
+            <w:tcBorders>
+              <w:top w:val="single" w:color="BFBFBF" w:sz="4"/>
+              <w:left w:val="single" w:color="BFBFBF" w:sz="4"/>
+              <w:bottom w:val="single" w:color="BFBFBF" w:sz="4"/>
+              <w:right w:val="single" w:color="BFBFBF" w:sz="4"/>
+            </w:tcBorders>
+            <w:tcMar>
+              <w:top w:type="dxa" w:w="60"/>
+              <w:left w:type="dxa" w:w="100"/>
+              <w:bottom w:type="dxa" w:w="60"/>
+              <w:right w:type="dxa" w:w="100"/>
+            </w:tcMar>
+          </w:tcPr>
+          <w:p>
+            <w:pPr>
+              <w:spacing w:after="40"/>
+            </w:pPr>
+            <w:r>
+              <w:rPr>
+                <w:sz w:val="19"/>
+                <w:szCs w:val="19"/>
+              </w:rPr>
+              <w:t xml:space="preserve">MODEL_CARD.md</w:t>
+            </w:r>
+          </w:p>
+        </w:tc>
+        <w:tc>
+          <w:tcPr>
+            <w:tcW w:type="dxa" w:w="6120"/>
+            <w:tcBorders>
+              <w:top w:val="single" w:color="BFBFBF" w:sz="4"/>
+              <w:left w:val="single" w:color="BFBFBF" w:sz="4"/>
+              <w:bottom w:val="single" w:color="BFBFBF" w:sz="4"/>
+              <w:right w:val="single" w:color="BFBFBF" w:sz="4"/>
+            </w:tcBorders>
+            <w:tcMar>
+              <w:top w:type="dxa" w:w="60"/>
+              <w:left w:type="dxa" w:w="100"/>
+              <w:bottom w:type="dxa" w:w="60"/>
+              <w:right w:type="dxa" w:w="100"/>
+            </w:tcMar>
+          </w:tcPr>
+          <w:p>
+            <w:pPr>
+              <w:spacing w:after="40"/>
+            </w:pPr>
+            <w:r>
+              <w:rPr>
+                <w:sz w:val="19"/>
+                <w:szCs w:val="19"/>
+              </w:rPr>
+              <w:t xml:space="preserve">05_Evidence/spinesurg-ct-nnunet/docs/MODEL_CARD.md</w:t>
+            </w:r>
+          </w:p>
+        </w:tc>
+      </w:tr>
+      <w:tr>
+        <w:trPr>
+          <w:tblHeader w:val="false"/>
+        </w:trPr>
+        <w:tc>
+          <w:tcPr>
+            <w:tcW w:type="dxa" w:w="3600"/>
+            <w:tcBorders>
+              <w:top w:val="single" w:color="BFBFBF" w:sz="4"/>
+              <w:left w:val="single" w:color="BFBFBF" w:sz="4"/>
+              <w:bottom w:val="single" w:color="BFBFBF" w:sz="4"/>
+              <w:right w:val="single" w:color="BFBFBF" w:sz="4"/>
+            </w:tcBorders>
+            <w:tcMar>
+              <w:top w:type="dxa" w:w="60"/>
+              <w:left w:type="dxa" w:w="100"/>
+              <w:bottom w:type="dxa" w:w="60"/>
+              <w:right w:type="dxa" w:w="100"/>
+            </w:tcMar>
+          </w:tcPr>
+          <w:p>
+            <w:pPr>
+              <w:spacing w:after="40"/>
+            </w:pPr>
+            <w:r>
+              <w:rPr>
+                <w:sz w:val="19"/>
+                <w:szCs w:val="19"/>
+              </w:rPr>
+              <w:t xml:space="preserve">PRIOR_ART_LEVEL_ID_XRAY.md</w:t>
+            </w:r>
+          </w:p>
+        </w:tc>
+        <w:tc>
+          <w:tcPr>
+            <w:tcW w:type="dxa" w:w="6120"/>
+            <w:tcBorders>
+              <w:top w:val="single" w:color="BFBFBF" w:sz="4"/>
+              <w:left w:val="single" w:color="BFBFBF" w:sz="4"/>
+              <w:bottom w:val="single" w:color="BFBFBF" w:sz="4"/>
+              <w:right w:val="single" w:color="BFBFBF" w:sz="4"/>
+            </w:tcBorders>
+            <w:tcMar>
+              <w:top w:type="dxa" w:w="60"/>
+              <w:left w:type="dxa" w:w="100"/>
+              <w:bottom w:type="dxa" w:w="60"/>
+              <w:right w:type="dxa" w:w="100"/>
+            </w:tcMar>
+          </w:tcPr>
+          <w:p>
+            <w:pPr>
+              <w:spacing w:after="40"/>
+            </w:pPr>
+            <w:r>
+              <w:rPr>
+                <w:sz w:val="19"/>
+                <w:szCs w:val="19"/>
+              </w:rPr>
+              <w:t xml:space="preserve">05_Evidence/spinesurg-ct-nnunet/docs/PRIOR_ART_LEVEL_ID_XRAY.md</w:t>
+            </w:r>
+          </w:p>
+        </w:tc>
+      </w:tr>
+      <w:tr>
+        <w:trPr>
+          <w:tblHeader w:val="false"/>
+        </w:trPr>
+        <w:tc>
+          <w:tcPr>
+            <w:tcW w:type="dxa" w:w="3600"/>
+            <w:tcBorders>
+              <w:top w:val="single" w:color="BFBFBF" w:sz="4"/>
+              <w:left w:val="single" w:color="BFBFBF" w:sz="4"/>
+              <w:bottom w:val="single" w:color="BFBFBF" w:sz="4"/>
+              <w:right w:val="single" w:color="BFBFBF" w:sz="4"/>
+            </w:tcBorders>
+            <w:tcMar>
+              <w:top w:type="dxa" w:w="60"/>
+              <w:left w:type="dxa" w:w="100"/>
+              <w:bottom w:type="dxa" w:w="60"/>
+              <w:right w:type="dxa" w:w="100"/>
+            </w:tcMar>
+          </w:tcPr>
+          <w:p>
+            <w:pPr>
+              <w:spacing w:after="40"/>
+            </w:pPr>
+            <w:r>
+              <w:rPr>
+                <w:sz w:val="19"/>
+                <w:szCs w:val="19"/>
+              </w:rPr>
+              <w:t xml:space="preserve">SWEEP_PROTOCOL.md</w:t>
+            </w:r>
+          </w:p>
+        </w:tc>
+        <w:tc>
+          <w:tcPr>
+            <w:tcW w:type="dxa" w:w="6120"/>
+            <w:tcBorders>
+              <w:top w:val="single" w:color="BFBFBF" w:sz="4"/>
+              <w:left w:val="single" w:color="BFBFBF" w:sz="4"/>
+              <w:bottom w:val="single" w:color="BFBFBF" w:sz="4"/>
+              <w:right w:val="single" w:color="BFBFBF" w:sz="4"/>
+            </w:tcBorders>
+            <w:tcMar>
+              <w:top w:type="dxa" w:w="60"/>
+              <w:left w:type="dxa" w:w="100"/>
+              <w:bottom w:type="dxa" w:w="60"/>
+              <w:right w:type="dxa" w:w="100"/>
+            </w:tcMar>
+          </w:tcPr>
+          <w:p>
+            <w:pPr>
+              <w:spacing w:after="40"/>
+            </w:pPr>
+            <w:r>
+              <w:rPr>
+                <w:sz w:val="19"/>
+                <w:szCs w:val="19"/>
+              </w:rPr>
+              <w:t xml:space="preserve">05_Evidence/spinesurg-ct-nnunet/docs/SWEEP_PROTOCOL.md</w:t>
+            </w:r>
+          </w:p>
+        </w:tc>
+      </w:tr>
+      <w:tr>
+        <w:trPr>
+          <w:tblHeader w:val="false"/>
+        </w:trPr>
+        <w:tc>
+          <w:tcPr>
+            <w:tcW w:type="dxa" w:w="3600"/>
+            <w:tcBorders>
+              <w:top w:val="single" w:color="BFBFBF" w:sz="4"/>
+              <w:left w:val="single" w:color="BFBFBF" w:sz="4"/>
+              <w:bottom w:val="single" w:color="BFBFBF" w:sz="4"/>
+              <w:right w:val="single" w:color="BFBFBF" w:sz="4"/>
+            </w:tcBorders>
+            <w:tcMar>
+              <w:top w:type="dxa" w:w="60"/>
+              <w:left w:type="dxa" w:w="100"/>
+              <w:bottom w:type="dxa" w:w="60"/>
+              <w:right w:type="dxa" w:w="100"/>
+            </w:tcMar>
+          </w:tcPr>
+          <w:p>
+            <w:pPr>
+              <w:spacing w:after="40"/>
+            </w:pPr>
+            <w:r>
+              <w:rPr>
+                <w:sz w:val="19"/>
+                <w:szCs w:val="19"/>
+              </w:rPr>
+              <w:t xml:space="preserve">tests/test_acquisition.py</w:t>
+            </w:r>
+          </w:p>
+        </w:tc>
+        <w:tc>
+          <w:tcPr>
+            <w:tcW w:type="dxa" w:w="6120"/>
+            <w:tcBorders>
+              <w:top w:val="single" w:color="BFBFBF" w:sz="4"/>
+              <w:left w:val="single" w:color="BFBFBF" w:sz="4"/>
+              <w:bottom w:val="single" w:color="BFBFBF" w:sz="4"/>
+              <w:right w:val="single" w:color="BFBFBF" w:sz="4"/>
+            </w:tcBorders>
+            <w:tcMar>
+              <w:top w:type="dxa" w:w="60"/>
+              <w:left w:type="dxa" w:w="100"/>
+              <w:bottom w:type="dxa" w:w="60"/>
+              <w:right w:type="dxa" w:w="100"/>
+            </w:tcMar>
+          </w:tcPr>
+          <w:p>
+            <w:pPr>
+              <w:spacing w:after="40"/>
+            </w:pPr>
+            <w:r>
+              <w:rPr>
+                <w:sz w:val="19"/>
+                <w:szCs w:val="19"/>
+              </w:rPr>
+              <w:t xml:space="preserve">05_Evidence/spinesurg-ct-nnunet/tests/test_acquisition.py</w:t>
+            </w:r>
+          </w:p>
+        </w:tc>
+      </w:tr>
+      <w:tr>
+        <w:trPr>
+          <w:tblHeader w:val="false"/>
+        </w:trPr>
+        <w:tc>
+          <w:tcPr>
+            <w:tcW w:type="dxa" w:w="3600"/>
+            <w:tcBorders>
+              <w:top w:val="single" w:color="BFBFBF" w:sz="4"/>
+              <w:left w:val="single" w:color="BFBFBF" w:sz="4"/>
+              <w:bottom w:val="single" w:color="BFBFBF" w:sz="4"/>
+              <w:right w:val="single" w:color="BFBFBF" w:sz="4"/>
+            </w:tcBorders>
+            <w:tcMar>
+              <w:top w:type="dxa" w:w="60"/>
+              <w:left w:type="dxa" w:w="100"/>
+              <w:bottom w:type="dxa" w:w="60"/>
+              <w:right w:type="dxa" w:w="100"/>
+            </w:tcMar>
+          </w:tcPr>
+          <w:p>
+            <w:pPr>
+              <w:spacing w:after="40"/>
+            </w:pPr>
+            <w:r>
+              <w:rPr>
+                <w:sz w:val="19"/>
+                <w:szCs w:val="19"/>
+              </w:rPr>
+              <w:t xml:space="preserve">acquisition.py</w:t>
+            </w:r>
+          </w:p>
+        </w:tc>
+        <w:tc>
+          <w:tcPr>
+            <w:tcW w:type="dxa" w:w="6120"/>
+            <w:tcBorders>
+              <w:top w:val="single" w:color="BFBFBF" w:sz="4"/>
+              <w:left w:val="single" w:color="BFBFBF" w:sz="4"/>
+              <w:bottom w:val="single" w:color="BFBFBF" w:sz="4"/>
+              <w:right w:val="single" w:color="BFBFBF" w:sz="4"/>
+            </w:tcBorders>
+            <w:tcMar>
+              <w:top w:type="dxa" w:w="60"/>
+              <w:left w:type="dxa" w:w="100"/>
+              <w:bottom w:type="dxa" w:w="60"/>
+              <w:right w:type="dxa" w:w="100"/>
+            </w:tcMar>
+          </w:tcPr>
+          <w:p>
+            <w:pPr>
+              <w:spacing w:after="40"/>
+            </w:pPr>
+            <w:r>
+              <w:rPr>
+                <w:sz w:val="19"/>
+                <w:szCs w:val="19"/>
+              </w:rPr>
+              <w:t xml:space="preserve">05_Evidence/spinesurg-ct-nnunet/tools/acquisition.py</w:t>
+            </w:r>
+          </w:p>
+        </w:tc>
+      </w:tr>
+      <w:tr>
+        <w:trPr>
+          <w:tblHeader w:val="false"/>
+        </w:trPr>
+        <w:tc>
+          <w:tcPr>
+            <w:tcW w:type="dxa" w:w="3600"/>
+            <w:tcBorders>
+              <w:top w:val="single" w:color="BFBFBF" w:sz="4"/>
+              <w:left w:val="single" w:color="BFBFBF" w:sz="4"/>
+              <w:bottom w:val="single" w:color="BFBFBF" w:sz="4"/>
+              <w:right w:val="single" w:color="BFBFBF" w:sz="4"/>
+            </w:tcBorders>
+            <w:tcMar>
+              <w:top w:type="dxa" w:w="60"/>
+              <w:left w:type="dxa" w:w="100"/>
+              <w:bottom w:type="dxa" w:w="60"/>
+              <w:right w:type="dxa" w:w="100"/>
+            </w:tcMar>
+          </w:tcPr>
+          <w:p>
+            <w:pPr>
+              <w:spacing w:after="40"/>
+            </w:pPr>
+            <w:r>
+              <w:rPr>
+                <w:sz w:val="19"/>
+                <w:szCs w:val="19"/>
+              </w:rPr>
+              <w:t xml:space="preserve">guided_console.py</w:t>
+            </w:r>
+          </w:p>
+        </w:tc>
+        <w:tc>
+          <w:tcPr>
+            <w:tcW w:type="dxa" w:w="6120"/>
+            <w:tcBorders>
+              <w:top w:val="single" w:color="BFBFBF" w:sz="4"/>
+              <w:left w:val="single" w:color="BFBFBF" w:sz="4"/>
+              <w:bottom w:val="single" w:color="BFBFBF" w:sz="4"/>
+              <w:right w:val="single" w:color="BFBFBF" w:sz="4"/>
+            </w:tcBorders>
+            <w:tcMar>
+              <w:top w:type="dxa" w:w="60"/>
+              <w:left w:type="dxa" w:w="100"/>
+              <w:bottom w:type="dxa" w:w="60"/>
+              <w:right w:type="dxa" w:w="100"/>
+            </w:tcMar>
+          </w:tcPr>
+          <w:p>
+            <w:pPr>
+              <w:spacing w:after="40"/>
+            </w:pPr>
+            <w:r>
+              <w:rPr>
+                <w:sz w:val="19"/>
+                <w:szCs w:val="19"/>
+              </w:rPr>
+              <w:t xml:space="preserve">05_Evidence/spinesurg-ct-nnunet/tools/guided_console.py</w:t>
+            </w:r>
+          </w:p>
+        </w:tc>
+      </w:tr>
+      <w:tr>
+        <w:trPr>
+          <w:tblHeader w:val="false"/>
+        </w:trPr>
+        <w:tc>
+          <w:tcPr>
+            <w:tcW w:type="dxa" w:w="3600"/>
+            <w:tcBorders>
+              <w:top w:val="single" w:color="BFBFBF" w:sz="4"/>
+              <w:left w:val="single" w:color="BFBFBF" w:sz="4"/>
+              <w:bottom w:val="single" w:color="BFBFBF" w:sz="4"/>
+              <w:right w:val="single" w:color="BFBFBF" w:sz="4"/>
+            </w:tcBorders>
+            <w:tcMar>
+              <w:top w:type="dxa" w:w="60"/>
+              <w:left w:type="dxa" w:w="100"/>
+              <w:bottom w:type="dxa" w:w="60"/>
+              <w:right w:type="dxa" w:w="100"/>
+            </w:tcMar>
+          </w:tcPr>
+          <w:p>
+            <w:pPr>
+              <w:spacing w:after="40"/>
+            </w:pPr>
+            <w:r>
+              <w:rPr>
+                <w:sz w:val="19"/>
+                <w:szCs w:val="19"/>
+              </w:rPr>
+              <w:t xml:space="preserve">level_selective.py</w:t>
+            </w:r>
+          </w:p>
+        </w:tc>
+        <w:tc>
+          <w:tcPr>
+            <w:tcW w:type="dxa" w:w="6120"/>
+            <w:tcBorders>
+              <w:top w:val="single" w:color="BFBFBF" w:sz="4"/>
+              <w:left w:val="single" w:color="BFBFBF" w:sz="4"/>
+              <w:bottom w:val="single" w:color="BFBFBF" w:sz="4"/>
+              <w:right w:val="single" w:color="BFBFBF" w:sz="4"/>
+            </w:tcBorders>
+            <w:tcMar>
+              <w:top w:type="dxa" w:w="60"/>
+              <w:left w:type="dxa" w:w="100"/>
+              <w:bottom w:type="dxa" w:w="60"/>
+              <w:right w:type="dxa" w:w="100"/>
+            </w:tcMar>
+          </w:tcPr>
+          <w:p>
+            <w:pPr>
+              <w:spacing w:after="40"/>
+            </w:pPr>
+            <w:r>
+              <w:rPr>
+                <w:sz w:val="19"/>
+                <w:szCs w:val="19"/>
+              </w:rPr>
+              <w:t xml:space="preserve">05_Evidence/spinesurg-ct-nnunet/tools/level_selective.py</w:t>
+            </w:r>
+          </w:p>
+        </w:tc>
+      </w:tr>
+      <w:tr>
+        <w:trPr>
+          <w:tblHeader w:val="false"/>
+        </w:trPr>
+        <w:tc>
+          <w:tcPr>
+            <w:tcW w:type="dxa" w:w="3600"/>
+            <w:tcBorders>
+              <w:top w:val="single" w:color="BFBFBF" w:sz="4"/>
+              <w:left w:val="single" w:color="BFBFBF" w:sz="4"/>
+              <w:bottom w:val="single" w:color="BFBFBF" w:sz="4"/>
+              <w:right w:val="single" w:color="BFBFBF" w:sz="4"/>
+            </w:tcBorders>
+            <w:tcMar>
+              <w:top w:type="dxa" w:w="60"/>
+              <w:left w:type="dxa" w:w="100"/>
+              <w:bottom w:type="dxa" w:w="60"/>
+              <w:right w:type="dxa" w:w="100"/>
+            </w:tcMar>
+          </w:tcPr>
+          <w:p>
+            <w:pPr>
+              <w:spacing w:after="40"/>
+            </w:pPr>
+            <w:r>
+              <w:rPr>
+                <w:sz w:val="19"/>
+                <w:szCs w:val="19"/>
+              </w:rPr>
+              <w:t xml:space="preserve">sweep_map.py</w:t>
+            </w:r>
+          </w:p>
+        </w:tc>
+        <w:tc>
+          <w:tcPr>
+            <w:tcW w:type="dxa" w:w="6120"/>
+            <w:tcBorders>
+              <w:top w:val="single" w:color="BFBFBF" w:sz="4"/>
+              <w:left w:val="single" w:color="BFBFBF" w:sz="4"/>
+              <w:bottom w:val="single" w:color="BFBFBF" w:sz="4"/>
+              <w:right w:val="single" w:color="BFBFBF" w:sz="4"/>
+            </w:tcBorders>
+            <w:tcMar>
+              <w:top w:type="dxa" w:w="60"/>
+              <w:left w:type="dxa" w:w="100"/>
+              <w:bottom w:type="dxa" w:w="60"/>
+              <w:right w:type="dxa" w:w="100"/>
+            </w:tcMar>
+          </w:tcPr>
+          <w:p>
+            <w:pPr>
+              <w:spacing w:after="40"/>
+            </w:pPr>
+            <w:r>
+              <w:rPr>
+                <w:sz w:val="19"/>
+                <w:szCs w:val="19"/>
+              </w:rPr>
+              <w:t xml:space="preserve">05_Evidence/spinesurg-ct-nnunet/tools/sweep_map.py</w:t>
+            </w:r>
+          </w:p>
+        </w:tc>
+      </w:tr>
+    </w:tbl>
+    <w:p>
+      <w:pPr>
+        <w:pStyle w:val="Heading1"/>
+        <w:pageBreakBefore/>
+      </w:pPr>
+      <w:r>
         <w:t xml:space="preserve">Appendix C. Open items for the meeting</w:t>
       </w:r>
     </w:p>
@@ -13071,7 +15162,7 @@
         <w:spacing w:after="80" w:line="264"/>
       </w:pPr>
       <w:r>
-        <w:t xml:space="preserve">Whether counsel needs repository access, or excerpts of the linked files.</w:t>
+        <w:t xml:space="preserve">Correcting the WSU disclosure timeline for the public items SCRUB_PLAN.md lists, and whether the GitHub purge requests should be filed.</w:t>
       </w:r>
     </w:p>
     <w:p>

</xml_diff>